<commit_message>
updating canny_pthread and report
</commit_message>
<xml_diff>
--- a/WEEK2/Embedded_SW_Project2_Report.docx
+++ b/WEEK2/Embedded_SW_Project2_Report.docx
@@ -145,25 +145,7 @@
           <w:sz w:val="24"/>
           <w:szCs w:val="24"/>
         </w:rPr>
-        <w:t xml:space="preserve">OpenMP and </w:t>
-      </w:r>
-      <w:proofErr w:type="spellStart"/>
-      <w:r>
-        <w:rPr>
-          <w:rFonts w:ascii="Robo" w:hAnsi="Robo" w:cs="Times New Roman"/>
-          <w:sz w:val="24"/>
-          <w:szCs w:val="24"/>
-        </w:rPr>
-        <w:t>pthread</w:t>
-      </w:r>
-      <w:proofErr w:type="spellEnd"/>
-      <w:r>
-        <w:rPr>
-          <w:rFonts w:ascii="Robo" w:hAnsi="Robo" w:cs="Times New Roman"/>
-          <w:sz w:val="24"/>
-          <w:szCs w:val="24"/>
-        </w:rPr>
-        <w:t xml:space="preserve"> are explored and implemented.</w:t>
+        <w:t>OpenMP and pthread are explored and implemented.</w:t>
       </w:r>
     </w:p>
     <w:p>
@@ -191,25 +173,7 @@
           <w:sz w:val="24"/>
           <w:szCs w:val="24"/>
         </w:rPr>
-        <w:t xml:space="preserve">improvement </w:t>
-      </w:r>
-      <w:proofErr w:type="gramStart"/>
-      <w:r>
-        <w:rPr>
-          <w:rFonts w:ascii="Robo" w:hAnsi="Robo" w:cs="Times New Roman"/>
-          <w:sz w:val="24"/>
-          <w:szCs w:val="24"/>
-        </w:rPr>
-        <w:t>of</w:t>
-      </w:r>
-      <w:proofErr w:type="gramEnd"/>
-      <w:r>
-        <w:rPr>
-          <w:rFonts w:ascii="Robo" w:hAnsi="Robo" w:cs="Times New Roman"/>
-          <w:sz w:val="24"/>
-          <w:szCs w:val="24"/>
-        </w:rPr>
-        <w:t xml:space="preserve"> performance</w:t>
+        <w:t>improvement of performance</w:t>
       </w:r>
       <w:r>
         <w:rPr>
@@ -462,25 +426,7 @@
           <w:b/>
           <w:bCs/>
         </w:rPr>
-        <w:t xml:space="preserve">Step 2 – Understanding the modifications on </w:t>
-      </w:r>
-      <w:proofErr w:type="spellStart"/>
-      <w:r>
-        <w:rPr>
-          <w:rFonts w:ascii="Robo" w:hAnsi="Robo"/>
-          <w:b/>
-          <w:bCs/>
-        </w:rPr>
-        <w:t>canny_local.c</w:t>
-      </w:r>
-      <w:proofErr w:type="spellEnd"/>
-      <w:r>
-        <w:rPr>
-          <w:rFonts w:ascii="Robo" w:hAnsi="Robo"/>
-          <w:b/>
-          <w:bCs/>
-        </w:rPr>
-        <w:t xml:space="preserve"> with OpenMP</w:t>
+        <w:t>Step 2 – Understanding the modifications on canny_local.c with OpenMP</w:t>
       </w:r>
     </w:p>
     <w:tbl>
@@ -517,7 +463,6 @@
                 <w:szCs w:val="32"/>
               </w:rPr>
             </w:pPr>
-            <w:proofErr w:type="spellStart"/>
             <w:r>
               <w:rPr>
                 <w:rFonts w:ascii="Robo" w:hAnsi="Robo"/>
@@ -528,7 +473,6 @@
               </w:rPr>
               <w:t>canny_local_omp.c</w:t>
             </w:r>
-            <w:proofErr w:type="spellEnd"/>
           </w:p>
         </w:tc>
         <w:tc>
@@ -554,7 +498,6 @@
                 <w:szCs w:val="32"/>
               </w:rPr>
             </w:pPr>
-            <w:proofErr w:type="spellStart"/>
             <w:r>
               <w:rPr>
                 <w:rFonts w:ascii="Robo" w:hAnsi="Robo"/>
@@ -565,7 +508,6 @@
               </w:rPr>
               <w:t>canny_local_.c</w:t>
             </w:r>
-            <w:proofErr w:type="spellEnd"/>
           </w:p>
         </w:tc>
       </w:tr>
@@ -647,35 +589,13 @@
               <w:rPr>
                 <w:rFonts w:ascii="Robo" w:hAnsi="Robo"/>
               </w:rPr>
-              <w:t xml:space="preserve">In </w:t>
+              <w:t xml:space="preserve">In Blur_x, </w:t>
             </w:r>
-            <w:proofErr w:type="spellStart"/>
             <w:r>
               <w:rPr>
                 <w:rFonts w:ascii="Robo" w:hAnsi="Robo"/>
               </w:rPr>
-              <w:t>Blur_x</w:t>
-            </w:r>
-            <w:proofErr w:type="spellEnd"/>
-            <w:r>
-              <w:rPr>
-                <w:rFonts w:ascii="Robo" w:hAnsi="Robo"/>
-              </w:rPr>
-              <w:t xml:space="preserve">, </w:t>
-            </w:r>
-            <w:proofErr w:type="spellStart"/>
-            <w:r>
-              <w:rPr>
-                <w:rFonts w:ascii="Robo" w:hAnsi="Robo"/>
-              </w:rPr>
-              <w:t>omp</w:t>
-            </w:r>
-            <w:proofErr w:type="spellEnd"/>
-            <w:r>
-              <w:rPr>
-                <w:rFonts w:ascii="Robo" w:hAnsi="Robo"/>
-              </w:rPr>
-              <w:t xml:space="preserve"> is implemented to </w:t>
+              <w:t xml:space="preserve">omp is implemented to </w:t>
             </w:r>
             <w:r>
               <w:rPr>
@@ -704,39 +624,17 @@
                 <w:rFonts w:ascii="Robo" w:hAnsi="Robo"/>
               </w:rPr>
             </w:pPr>
-            <w:proofErr w:type="spellStart"/>
             <w:r>
               <w:rPr>
                 <w:rFonts w:ascii="Robo" w:hAnsi="Robo"/>
               </w:rPr>
-              <w:t>omp_set_dynamic</w:t>
-            </w:r>
-            <w:proofErr w:type="spellEnd"/>
-            <w:r>
-              <w:rPr>
-                <w:rFonts w:ascii="Robo" w:hAnsi="Robo"/>
-              </w:rPr>
-              <w:t>(0)</w:t>
+              <w:t>omp_set_dynamic(0)</w:t>
             </w:r>
             <w:r>
               <w:rPr>
                 <w:rFonts w:ascii="Robo" w:hAnsi="Robo"/>
               </w:rPr>
-              <w:t xml:space="preserve"> configured </w:t>
-            </w:r>
-            <w:proofErr w:type="spellStart"/>
-            <w:r>
-              <w:rPr>
-                <w:rFonts w:ascii="Robo" w:hAnsi="Robo"/>
-              </w:rPr>
-              <w:t>omp</w:t>
-            </w:r>
-            <w:proofErr w:type="spellEnd"/>
-            <w:r>
-              <w:rPr>
-                <w:rFonts w:ascii="Robo" w:hAnsi="Robo"/>
-              </w:rPr>
-              <w:t xml:space="preserve"> to not changing thread numbers dynamically unless limited by hardware resource.</w:t>
+              <w:t xml:space="preserve"> configured omp to not changing thread numbers dynamically unless limited by hardware resource.</w:t>
             </w:r>
           </w:p>
         </w:tc>
@@ -1045,41 +943,13 @@
               <w:rPr>
                 <w:rFonts w:ascii="Robo" w:hAnsi="Robo"/>
               </w:rPr>
-              <w:t xml:space="preserve">#pragma </w:t>
-            </w:r>
-            <w:proofErr w:type="spellStart"/>
-            <w:r>
-              <w:rPr>
-                <w:rFonts w:ascii="Robo" w:hAnsi="Robo"/>
-              </w:rPr>
-              <w:t>omp</w:t>
-            </w:r>
-            <w:proofErr w:type="spellEnd"/>
-            <w:r>
-              <w:rPr>
-                <w:rFonts w:ascii="Robo" w:hAnsi="Robo"/>
-              </w:rPr>
-              <w:t xml:space="preserve"> for</w:t>
+              <w:t>#pragma omp for</w:t>
             </w:r>
             <w:r>
               <w:rPr>
                 <w:rFonts w:ascii="Robo" w:hAnsi="Robo"/>
               </w:rPr>
-              <w:t xml:space="preserve">… </w:t>
-            </w:r>
-            <w:proofErr w:type="spellStart"/>
-            <w:r>
-              <w:rPr>
-                <w:rFonts w:ascii="Robo" w:hAnsi="Robo"/>
-              </w:rPr>
-              <w:t>dertermins</w:t>
-            </w:r>
-            <w:proofErr w:type="spellEnd"/>
-            <w:r>
-              <w:rPr>
-                <w:rFonts w:ascii="Robo" w:hAnsi="Robo"/>
-              </w:rPr>
-              <w:t xml:space="preserve"> the for loop to be run separately in each thread. </w:t>
+              <w:t xml:space="preserve">… dertermins the for loop to be run separately in each thread. </w:t>
             </w:r>
             <w:r>
               <w:rPr>
@@ -1527,56 +1397,16 @@
           <w:u w:color="000000"/>
           <w:lang w:eastAsia="zh-CN"/>
         </w:rPr>
-        <w:t xml:space="preserve"> the user time is the total </w:t>
-      </w:r>
-      <w:proofErr w:type="spellStart"/>
-      <w:r>
-        <w:rPr>
-          <w:rFonts w:ascii="Robo" w:eastAsia="Calibri" w:hAnsi="Robo"/>
-          <w:color w:val="000000"/>
-          <w:u w:color="000000"/>
-          <w:lang w:eastAsia="zh-CN"/>
-        </w:rPr>
-        <w:t>cpu</w:t>
-      </w:r>
-      <w:proofErr w:type="spellEnd"/>
-      <w:r>
-        <w:rPr>
-          <w:rFonts w:ascii="Robo" w:eastAsia="Calibri" w:hAnsi="Robo"/>
-          <w:color w:val="000000"/>
-          <w:u w:color="000000"/>
-          <w:lang w:eastAsia="zh-CN"/>
-        </w:rPr>
-        <w:t xml:space="preserve"> time and system time is the kernel time. With multithreading, the wall time is improved</w:t>
-      </w:r>
-      <w:r>
-        <w:rPr>
-          <w:rFonts w:ascii="Robo" w:eastAsia="Calibri" w:hAnsi="Robo"/>
-          <w:color w:val="000000"/>
-          <w:u w:color="000000"/>
-          <w:lang w:eastAsia="zh-CN"/>
-        </w:rPr>
-        <w:t xml:space="preserve"> and </w:t>
-      </w:r>
-      <w:proofErr w:type="spellStart"/>
-      <w:r>
-        <w:rPr>
-          <w:rFonts w:ascii="Robo" w:eastAsia="Calibri" w:hAnsi="Robo"/>
-          <w:color w:val="000000"/>
-          <w:u w:color="000000"/>
-          <w:lang w:eastAsia="zh-CN"/>
-        </w:rPr>
-        <w:t>cpu</w:t>
-      </w:r>
-      <w:proofErr w:type="spellEnd"/>
-      <w:r>
-        <w:rPr>
-          <w:rFonts w:ascii="Robo" w:eastAsia="Calibri" w:hAnsi="Robo"/>
-          <w:color w:val="000000"/>
-          <w:u w:color="000000"/>
-          <w:lang w:eastAsia="zh-CN"/>
-        </w:rPr>
-        <w:t>/system time increased due to multithread/core execution.</w:t>
+        <w:t xml:space="preserve"> the user time is the total cpu time and system time is the kernel time. With multithreading, the wall time is improved</w:t>
+      </w:r>
+      <w:r>
+        <w:rPr>
+          <w:rFonts w:ascii="Robo" w:eastAsia="Calibri" w:hAnsi="Robo"/>
+          <w:color w:val="000000"/>
+          <w:u w:color="000000"/>
+          <w:lang w:eastAsia="zh-CN"/>
+        </w:rPr>
+        <w:t xml:space="preserve"> and cpu/system time increased due to multithread/core execution.</w:t>
       </w:r>
       <w:r>
         <w:rPr>
@@ -1601,7 +1431,6 @@
     </w:p>
     <w:p>
       <w:pPr>
-        <w:jc w:val="both"/>
         <w:rPr>
           <w:rFonts w:ascii="Robo" w:eastAsia="Calibri" w:hAnsi="Robo"/>
           <w:b/>
@@ -1620,7 +1449,7 @@
           <w:u w:color="000000"/>
           <w:lang w:eastAsia="zh-CN"/>
         </w:rPr>
-        <w:t>Step 4 – Use OpenMP to parallelize Blur in the y direction</w:t>
+        <w:br w:type="page"/>
       </w:r>
     </w:p>
     <w:p>
@@ -1635,10 +1464,1343 @@
           <w:lang w:eastAsia="zh-CN"/>
         </w:rPr>
       </w:pPr>
+      <w:r>
+        <w:rPr>
+          <w:rFonts w:ascii="Robo" w:eastAsia="Calibri" w:hAnsi="Robo"/>
+          <w:b/>
+          <w:bCs/>
+          <w:color w:val="000000"/>
+          <w:u w:color="000000"/>
+          <w:lang w:eastAsia="zh-CN"/>
+        </w:rPr>
+        <w:lastRenderedPageBreak/>
+        <w:t>Step 4 – Use OpenMP to parallelize Blur in the y direction</w:t>
+      </w:r>
     </w:p>
     <w:p>
       <w:pPr>
         <w:jc w:val="both"/>
+        <w:rPr>
+          <w:rFonts w:ascii="Robo" w:eastAsia="Calibri" w:hAnsi="Robo"/>
+          <w:b/>
+          <w:bCs/>
+          <w:color w:val="000000"/>
+          <w:u w:color="000000"/>
+          <w:lang w:eastAsia="zh-CN"/>
+        </w:rPr>
+      </w:pPr>
+      <w:r>
+        <w:rPr>
+          <w:rFonts w:ascii="Robo" w:eastAsia="Calibri" w:hAnsi="Robo"/>
+          <w:b/>
+          <w:bCs/>
+          <w:color w:val="000000"/>
+          <w:u w:color="000000"/>
+          <w:lang w:eastAsia="zh-CN"/>
+        </w:rPr>
+        <w:drawing>
+          <wp:inline distT="0" distB="0" distL="0" distR="0" wp14:anchorId="30666DA8" wp14:editId="7B177AC5">
+            <wp:extent cx="4876800" cy="2415475"/>
+            <wp:effectExtent l="0" t="0" r="0" b="4445"/>
+            <wp:docPr id="862161568" name="圖片 1" descr="一張含有 文字, 螢幕擷取畫面, 字型, 數字 的圖片&#10;&#10;AI 產生的內容可能不正確。"/>
+            <wp:cNvGraphicFramePr>
+              <a:graphicFrameLocks xmlns:a="http://schemas.openxmlformats.org/drawingml/2006/main" noChangeAspect="1"/>
+            </wp:cNvGraphicFramePr>
+            <a:graphic xmlns:a="http://schemas.openxmlformats.org/drawingml/2006/main">
+              <a:graphicData uri="http://schemas.openxmlformats.org/drawingml/2006/picture">
+                <pic:pic xmlns:pic="http://schemas.openxmlformats.org/drawingml/2006/picture">
+                  <pic:nvPicPr>
+                    <pic:cNvPr id="862161568" name="圖片 1" descr="一張含有 文字, 螢幕擷取畫面, 字型, 數字 的圖片&#10;&#10;AI 產生的內容可能不正確。"/>
+                    <pic:cNvPicPr/>
+                  </pic:nvPicPr>
+                  <pic:blipFill>
+                    <a:blip r:embed="rId12"/>
+                    <a:stretch>
+                      <a:fillRect/>
+                    </a:stretch>
+                  </pic:blipFill>
+                  <pic:spPr>
+                    <a:xfrm>
+                      <a:off x="0" y="0"/>
+                      <a:ext cx="4879841" cy="2416981"/>
+                    </a:xfrm>
+                    <a:prstGeom prst="rect">
+                      <a:avLst/>
+                    </a:prstGeom>
+                  </pic:spPr>
+                </pic:pic>
+              </a:graphicData>
+            </a:graphic>
+          </wp:inline>
+        </w:drawing>
+      </w:r>
+    </w:p>
+    <w:p>
+      <w:pPr>
+        <w:jc w:val="both"/>
+        <w:rPr>
+          <w:rFonts w:ascii="Robo" w:eastAsia="Calibri" w:hAnsi="Robo"/>
+          <w:color w:val="000000"/>
+          <w:u w:color="000000"/>
+          <w:lang w:eastAsia="zh-CN"/>
+        </w:rPr>
+      </w:pPr>
+      <w:r>
+        <w:rPr>
+          <w:rFonts w:ascii="Robo" w:eastAsia="Calibri" w:hAnsi="Robo"/>
+          <w:color w:val="000000"/>
+          <w:u w:color="000000"/>
+          <w:lang w:eastAsia="zh-CN"/>
+        </w:rPr>
+        <w:t xml:space="preserve">OpenMP is implemented for Blur Y shown as above. </w:t>
+      </w:r>
+      <w:r>
+        <w:rPr>
+          <w:rFonts w:ascii="Robo" w:eastAsia="Calibri" w:hAnsi="Robo"/>
+          <w:color w:val="000000"/>
+          <w:u w:color="000000"/>
+          <w:lang w:eastAsia="zh-CN"/>
+        </w:rPr>
+        <w:t xml:space="preserve">In BlurY multithreading implementation, </w:t>
+      </w:r>
+      <w:r>
+        <w:rPr>
+          <w:rFonts w:ascii="Robo" w:eastAsia="Calibri" w:hAnsi="Robo"/>
+          <w:color w:val="000000"/>
+          <w:u w:color="000000"/>
+          <w:lang w:eastAsia="zh-CN"/>
+        </w:rPr>
+        <w:t xml:space="preserve">n_thread isn’t declared again since </w:t>
+      </w:r>
+      <w:r>
+        <w:rPr>
+          <w:rFonts w:ascii="Robo" w:eastAsia="Calibri" w:hAnsi="Robo"/>
+          <w:color w:val="000000"/>
+          <w:u w:color="000000"/>
+          <w:lang w:eastAsia="zh-CN"/>
+        </w:rPr>
+        <w:t xml:space="preserve">it was done before BlurX. </w:t>
+      </w:r>
+      <w:r>
+        <w:rPr>
+          <w:rFonts w:ascii="Robo" w:eastAsia="Calibri" w:hAnsi="Robo"/>
+          <w:color w:val="000000"/>
+          <w:u w:color="000000"/>
+          <w:lang w:eastAsia="zh-CN"/>
+        </w:rPr>
+        <w:t xml:space="preserve">The variables to be copied are </w:t>
+      </w:r>
+      <w:r>
+        <w:rPr>
+          <w:rFonts w:ascii="Robo" w:eastAsia="Calibri" w:hAnsi="Robo"/>
+          <w:color w:val="000000"/>
+          <w:u w:color="000000"/>
+          <w:lang w:eastAsia="zh-CN"/>
+        </w:rPr>
+        <w:t>(</w:t>
+      </w:r>
+      <w:r>
+        <w:rPr>
+          <w:rFonts w:ascii="Robo" w:eastAsia="Calibri" w:hAnsi="Robo"/>
+          <w:color w:val="000000"/>
+          <w:u w:color="000000"/>
+          <w:lang w:eastAsia="zh-CN"/>
+        </w:rPr>
+        <w:t>r, rr, dot, sum</w:t>
+      </w:r>
+      <w:r>
+        <w:rPr>
+          <w:rFonts w:ascii="Robo" w:eastAsia="Calibri" w:hAnsi="Robo"/>
+          <w:color w:val="000000"/>
+          <w:u w:color="000000"/>
+          <w:lang w:eastAsia="zh-CN"/>
+        </w:rPr>
+        <w:t>)</w:t>
+      </w:r>
+      <w:r>
+        <w:rPr>
+          <w:rFonts w:ascii="Robo" w:eastAsia="Calibri" w:hAnsi="Robo"/>
+          <w:color w:val="000000"/>
+          <w:u w:color="000000"/>
+          <w:lang w:eastAsia="zh-CN"/>
+        </w:rPr>
+        <w:t>.</w:t>
+      </w:r>
+    </w:p>
+    <w:p>
+      <w:pPr>
+        <w:jc w:val="both"/>
+        <w:rPr>
+          <w:rFonts w:ascii="Robo" w:eastAsia="Calibri" w:hAnsi="Robo"/>
+          <w:color w:val="000000"/>
+          <w:u w:color="000000"/>
+          <w:lang w:eastAsia="zh-CN"/>
+        </w:rPr>
+      </w:pPr>
+      <w:r>
+        <w:rPr>
+          <w:rFonts w:ascii="Robo" w:eastAsia="Calibri" w:hAnsi="Robo"/>
+          <w:color w:val="000000"/>
+          <w:u w:color="000000"/>
+          <w:lang w:eastAsia="zh-CN"/>
+        </w:rPr>
+        <w:t>t</w:t>
+      </w:r>
+      <w:r>
+        <w:rPr>
+          <w:rFonts w:ascii="Robo" w:eastAsia="Calibri" w:hAnsi="Robo"/>
+          <w:color w:val="000000"/>
+          <w:u w:color="000000"/>
+          <w:lang w:eastAsia="zh-CN"/>
+        </w:rPr>
+        <w:t>empim and kernel are free</w:t>
+      </w:r>
+      <w:r>
+        <w:rPr>
+          <w:rFonts w:ascii="Robo" w:eastAsia="Calibri" w:hAnsi="Robo"/>
+          <w:color w:val="000000"/>
+          <w:u w:color="000000"/>
+          <w:lang w:eastAsia="zh-CN"/>
+        </w:rPr>
+        <w:t xml:space="preserve">d </w:t>
+      </w:r>
+      <w:r>
+        <w:rPr>
+          <w:rFonts w:ascii="Robo" w:eastAsia="Calibri" w:hAnsi="Robo"/>
+          <w:color w:val="000000"/>
+          <w:u w:color="000000"/>
+          <w:lang w:eastAsia="zh-CN"/>
+        </w:rPr>
+        <w:t>after all the threads are done execution.</w:t>
+      </w:r>
+    </w:p>
+    <w:p>
+      <w:pPr>
+        <w:jc w:val="both"/>
+        <w:rPr>
+          <w:rFonts w:ascii="Robo" w:eastAsia="Calibri" w:hAnsi="Robo"/>
+          <w:color w:val="000000"/>
+          <w:u w:color="000000"/>
+          <w:lang w:eastAsia="zh-CN"/>
+        </w:rPr>
+      </w:pPr>
+    </w:p>
+    <w:p>
+      <w:pPr>
+        <w:jc w:val="both"/>
+        <w:rPr>
+          <w:rFonts w:ascii="Robo" w:eastAsia="Calibri" w:hAnsi="Robo"/>
+          <w:color w:val="000000"/>
+          <w:u w:color="000000"/>
+          <w:lang w:eastAsia="zh-CN"/>
+        </w:rPr>
+      </w:pPr>
+      <w:r>
+        <w:rPr>
+          <w:rFonts w:ascii="Robo" w:eastAsia="Calibri" w:hAnsi="Robo"/>
+          <w:color w:val="000000"/>
+          <w:u w:color="000000"/>
+          <w:lang w:eastAsia="zh-CN"/>
+        </w:rPr>
+        <w:drawing>
+          <wp:inline distT="0" distB="0" distL="0" distR="0" wp14:anchorId="5B4A05FA" wp14:editId="5A75594A">
+            <wp:extent cx="3800475" cy="2684695"/>
+            <wp:effectExtent l="0" t="0" r="0" b="1905"/>
+            <wp:docPr id="340170767" name="圖片 1" descr="一張含有 文字, 螢幕擷取畫面 的圖片&#10;&#10;AI 產生的內容可能不正確。"/>
+            <wp:cNvGraphicFramePr>
+              <a:graphicFrameLocks xmlns:a="http://schemas.openxmlformats.org/drawingml/2006/main" noChangeAspect="1"/>
+            </wp:cNvGraphicFramePr>
+            <a:graphic xmlns:a="http://schemas.openxmlformats.org/drawingml/2006/main">
+              <a:graphicData uri="http://schemas.openxmlformats.org/drawingml/2006/picture">
+                <pic:pic xmlns:pic="http://schemas.openxmlformats.org/drawingml/2006/picture">
+                  <pic:nvPicPr>
+                    <pic:cNvPr id="340170767" name="圖片 1" descr="一張含有 文字, 螢幕擷取畫面 的圖片&#10;&#10;AI 產生的內容可能不正確。"/>
+                    <pic:cNvPicPr/>
+                  </pic:nvPicPr>
+                  <pic:blipFill>
+                    <a:blip r:embed="rId13"/>
+                    <a:stretch>
+                      <a:fillRect/>
+                    </a:stretch>
+                  </pic:blipFill>
+                  <pic:spPr>
+                    <a:xfrm>
+                      <a:off x="0" y="0"/>
+                      <a:ext cx="3808422" cy="2690309"/>
+                    </a:xfrm>
+                    <a:prstGeom prst="rect">
+                      <a:avLst/>
+                    </a:prstGeom>
+                  </pic:spPr>
+                </pic:pic>
+              </a:graphicData>
+            </a:graphic>
+          </wp:inline>
+        </w:drawing>
+      </w:r>
+    </w:p>
+    <w:p>
+      <w:pPr>
+        <w:jc w:val="both"/>
+        <w:rPr>
+          <w:rFonts w:ascii="Robo" w:eastAsia="Calibri" w:hAnsi="Robo"/>
+          <w:color w:val="000000"/>
+          <w:u w:color="000000"/>
+          <w:lang w:eastAsia="zh-CN"/>
+        </w:rPr>
+      </w:pPr>
+      <w:r>
+        <w:rPr>
+          <w:rFonts w:ascii="Robo" w:eastAsia="Calibri" w:hAnsi="Robo"/>
+          <w:color w:val="000000"/>
+          <w:u w:color="000000"/>
+          <w:lang w:eastAsia="zh-CN"/>
+        </w:rPr>
+        <w:t xml:space="preserve">From this </w:t>
+      </w:r>
+      <w:r>
+        <w:rPr>
+          <w:rFonts w:ascii="Robo" w:eastAsia="Calibri" w:hAnsi="Robo"/>
+          <w:color w:val="000000"/>
+          <w:u w:color="000000"/>
+          <w:lang w:eastAsia="zh-CN"/>
+        </w:rPr>
+        <w:t>snapshot</w:t>
+      </w:r>
+      <w:r>
+        <w:rPr>
+          <w:rFonts w:ascii="Robo" w:eastAsia="Calibri" w:hAnsi="Robo"/>
+          <w:color w:val="000000"/>
+          <w:u w:color="000000"/>
+          <w:lang w:eastAsia="zh-CN"/>
+        </w:rPr>
+        <w:t xml:space="preserve">, we can see there are also 4 threads </w:t>
+      </w:r>
+      <w:r>
+        <w:rPr>
+          <w:rFonts w:ascii="Robo" w:eastAsia="Calibri" w:hAnsi="Robo"/>
+          <w:color w:val="000000"/>
+          <w:u w:color="000000"/>
+          <w:lang w:eastAsia="zh-CN"/>
+        </w:rPr>
+        <w:t>created</w:t>
+      </w:r>
+      <w:r>
+        <w:rPr>
+          <w:rFonts w:ascii="Robo" w:eastAsia="Calibri" w:hAnsi="Robo"/>
+          <w:color w:val="000000"/>
+          <w:u w:color="000000"/>
+          <w:lang w:eastAsia="zh-CN"/>
+        </w:rPr>
+        <w:t xml:space="preserve"> for </w:t>
+      </w:r>
+      <w:r>
+        <w:rPr>
+          <w:rFonts w:ascii="Robo" w:eastAsia="Calibri" w:hAnsi="Robo"/>
+          <w:color w:val="000000"/>
+          <w:u w:color="000000"/>
+          <w:lang w:eastAsia="zh-CN"/>
+        </w:rPr>
+        <w:t>Blur Y.</w:t>
+      </w:r>
+    </w:p>
+    <w:p>
+      <w:pPr>
+        <w:jc w:val="both"/>
+        <w:rPr>
+          <w:rFonts w:ascii="Robo" w:eastAsia="Calibri" w:hAnsi="Robo"/>
+          <w:color w:val="000000"/>
+          <w:u w:color="000000"/>
+          <w:lang w:eastAsia="zh-CN"/>
+        </w:rPr>
+      </w:pPr>
+      <w:r>
+        <w:rPr>
+          <w:rFonts w:ascii="Robo" w:eastAsia="Calibri" w:hAnsi="Robo"/>
+          <w:color w:val="000000"/>
+          <w:u w:color="000000"/>
+          <w:lang w:eastAsia="zh-CN"/>
+        </w:rPr>
+        <w:t xml:space="preserve">And from the time result below, we can tell the </w:t>
+      </w:r>
+      <w:r>
+        <w:rPr>
+          <w:rFonts w:ascii="Robo" w:eastAsia="Calibri" w:hAnsi="Robo"/>
+          <w:color w:val="000000"/>
+          <w:u w:color="000000"/>
+          <w:lang w:eastAsia="zh-CN"/>
+        </w:rPr>
+        <w:t xml:space="preserve">real time is improved by </w:t>
+      </w:r>
+      <w:r>
+        <w:rPr>
+          <w:rFonts w:ascii="Robo" w:eastAsia="Calibri" w:hAnsi="Robo"/>
+          <w:color w:val="000000"/>
+          <w:u w:color="000000"/>
+          <w:lang w:eastAsia="zh-CN"/>
+        </w:rPr>
+        <w:t xml:space="preserve">approximately </w:t>
+      </w:r>
+      <w:r>
+        <w:rPr>
+          <w:rFonts w:ascii="Robo" w:eastAsia="Calibri" w:hAnsi="Robo"/>
+          <w:b/>
+          <w:bCs/>
+          <w:color w:val="000000"/>
+          <w:u w:color="000000"/>
+          <w:lang w:eastAsia="zh-CN"/>
+        </w:rPr>
+        <w:t>33</w:t>
+      </w:r>
+      <w:r>
+        <w:rPr>
+          <w:rFonts w:ascii="Robo" w:eastAsia="Calibri" w:hAnsi="Robo"/>
+          <w:b/>
+          <w:bCs/>
+          <w:color w:val="000000"/>
+          <w:u w:color="000000"/>
+          <w:lang w:eastAsia="zh-CN"/>
+        </w:rPr>
+        <w:t xml:space="preserve">% </w:t>
+      </w:r>
+      <w:r>
+        <w:rPr>
+          <w:rFonts w:ascii="Robo" w:eastAsia="Calibri" w:hAnsi="Robo"/>
+          <w:color w:val="000000"/>
+          <w:u w:color="000000"/>
+          <w:lang w:eastAsia="zh-CN"/>
+        </w:rPr>
+        <w:t xml:space="preserve">compared to </w:t>
+      </w:r>
+      <w:r>
+        <w:rPr>
+          <w:rFonts w:ascii="Robo" w:eastAsia="Calibri" w:hAnsi="Robo"/>
+          <w:color w:val="000000"/>
+          <w:u w:color="000000"/>
+          <w:lang w:eastAsia="zh-CN"/>
+        </w:rPr>
+        <w:t xml:space="preserve">the original </w:t>
+      </w:r>
+      <w:r>
+        <w:rPr>
+          <w:rFonts w:ascii="Robo" w:eastAsia="Calibri" w:hAnsi="Robo"/>
+          <w:color w:val="000000"/>
+          <w:u w:color="000000"/>
+          <w:lang w:eastAsia="zh-CN"/>
+        </w:rPr>
+        <w:t>application without multithreading</w:t>
+      </w:r>
+      <w:r>
+        <w:rPr>
+          <w:rFonts w:ascii="Robo" w:eastAsia="Calibri" w:hAnsi="Robo"/>
+          <w:color w:val="000000"/>
+          <w:u w:color="000000"/>
+          <w:lang w:eastAsia="zh-CN"/>
+        </w:rPr>
+        <w:t xml:space="preserve"> and </w:t>
+      </w:r>
+      <w:r>
+        <w:rPr>
+          <w:rFonts w:ascii="Robo" w:eastAsia="Calibri" w:hAnsi="Robo"/>
+          <w:b/>
+          <w:bCs/>
+          <w:color w:val="000000"/>
+          <w:u w:color="000000"/>
+          <w:lang w:eastAsia="zh-CN"/>
+        </w:rPr>
+        <w:t>15 %</w:t>
+      </w:r>
+      <w:r>
+        <w:rPr>
+          <w:rFonts w:ascii="Robo" w:eastAsia="Calibri" w:hAnsi="Robo"/>
+          <w:color w:val="000000"/>
+          <w:u w:color="000000"/>
+          <w:lang w:eastAsia="zh-CN"/>
+        </w:rPr>
+        <w:t xml:space="preserve"> </w:t>
+      </w:r>
+      <w:r>
+        <w:rPr>
+          <w:rFonts w:ascii="Robo" w:eastAsia="Calibri" w:hAnsi="Robo"/>
+          <w:color w:val="000000"/>
+          <w:u w:color="000000"/>
+          <w:lang w:eastAsia="zh-CN"/>
+        </w:rPr>
+        <w:t>compared</w:t>
+      </w:r>
+      <w:r>
+        <w:rPr>
+          <w:rFonts w:ascii="Robo" w:eastAsia="Calibri" w:hAnsi="Robo"/>
+          <w:color w:val="000000"/>
+          <w:u w:color="000000"/>
+          <w:lang w:eastAsia="zh-CN"/>
+        </w:rPr>
+        <w:t xml:space="preserve"> to the application which only implemented m</w:t>
+      </w:r>
+      <w:r>
+        <w:rPr>
+          <w:rFonts w:ascii="Robo" w:eastAsia="Calibri" w:hAnsi="Robo"/>
+          <w:color w:val="000000"/>
+          <w:u w:color="000000"/>
+          <w:lang w:eastAsia="zh-CN"/>
+        </w:rPr>
+        <w:t>u</w:t>
+      </w:r>
+      <w:r>
+        <w:rPr>
+          <w:rFonts w:ascii="Robo" w:eastAsia="Calibri" w:hAnsi="Robo"/>
+          <w:color w:val="000000"/>
+          <w:u w:color="000000"/>
+          <w:lang w:eastAsia="zh-CN"/>
+        </w:rPr>
+        <w:t>ltithreading in BlurX.</w:t>
+      </w:r>
+    </w:p>
+    <w:p>
+      <w:pPr>
+        <w:jc w:val="both"/>
+        <w:rPr>
+          <w:rFonts w:ascii="Robo" w:eastAsia="Calibri" w:hAnsi="Robo"/>
+          <w:color w:val="000000"/>
+          <w:u w:color="000000"/>
+          <w:lang w:eastAsia="zh-CN"/>
+        </w:rPr>
+      </w:pPr>
+    </w:p>
+    <w:p>
+      <w:pPr>
+        <w:jc w:val="both"/>
+        <w:rPr>
+          <w:rFonts w:ascii="Robo" w:eastAsia="Calibri" w:hAnsi="Robo"/>
+          <w:color w:val="000000"/>
+          <w:u w:color="000000"/>
+          <w:lang w:eastAsia="zh-CN"/>
+        </w:rPr>
+      </w:pPr>
+      <w:r>
+        <w:rPr>
+          <w:rFonts w:ascii="Robo" w:eastAsia="Calibri" w:hAnsi="Robo"/>
+          <w:color w:val="000000"/>
+          <w:u w:color="000000"/>
+          <w:lang w:eastAsia="zh-CN"/>
+        </w:rPr>
+        <w:t>real</w:t>
+      </w:r>
+      <w:r>
+        <w:rPr>
+          <w:rFonts w:ascii="Robo" w:eastAsia="Calibri" w:hAnsi="Robo"/>
+          <w:color w:val="000000"/>
+          <w:u w:color="000000"/>
+          <w:lang w:eastAsia="zh-CN"/>
+        </w:rPr>
+        <w:tab/>
+        <w:t>0m0.662s</w:t>
+      </w:r>
+    </w:p>
+    <w:p>
+      <w:pPr>
+        <w:jc w:val="both"/>
+        <w:rPr>
+          <w:rFonts w:ascii="Robo" w:eastAsia="Calibri" w:hAnsi="Robo"/>
+          <w:color w:val="000000"/>
+          <w:u w:color="000000"/>
+          <w:lang w:eastAsia="zh-CN"/>
+        </w:rPr>
+      </w:pPr>
+      <w:r>
+        <w:rPr>
+          <w:rFonts w:ascii="Robo" w:eastAsia="Calibri" w:hAnsi="Robo"/>
+          <w:color w:val="000000"/>
+          <w:u w:color="000000"/>
+          <w:lang w:eastAsia="zh-CN"/>
+        </w:rPr>
+        <w:t>user</w:t>
+      </w:r>
+      <w:r>
+        <w:rPr>
+          <w:rFonts w:ascii="Robo" w:eastAsia="Calibri" w:hAnsi="Robo"/>
+          <w:color w:val="000000"/>
+          <w:u w:color="000000"/>
+          <w:lang w:eastAsia="zh-CN"/>
+        </w:rPr>
+        <w:tab/>
+        <w:t>0m0.913s</w:t>
+      </w:r>
+    </w:p>
+    <w:p>
+      <w:pPr>
+        <w:jc w:val="both"/>
+        <w:rPr>
+          <w:rFonts w:ascii="Robo" w:eastAsia="Calibri" w:hAnsi="Robo"/>
+          <w:color w:val="000000"/>
+          <w:u w:color="000000"/>
+          <w:lang w:eastAsia="zh-CN"/>
+        </w:rPr>
+      </w:pPr>
+      <w:r>
+        <w:rPr>
+          <w:rFonts w:ascii="Robo" w:eastAsia="Calibri" w:hAnsi="Robo"/>
+          <w:color w:val="000000"/>
+          <w:u w:color="000000"/>
+          <w:lang w:eastAsia="zh-CN"/>
+        </w:rPr>
+        <w:t>sys</w:t>
+      </w:r>
+      <w:r>
+        <w:rPr>
+          <w:rFonts w:ascii="Robo" w:eastAsia="Calibri" w:hAnsi="Robo"/>
+          <w:color w:val="000000"/>
+          <w:u w:color="000000"/>
+          <w:lang w:eastAsia="zh-CN"/>
+        </w:rPr>
+        <w:tab/>
+        <w:t>0m0.044s</w:t>
+      </w:r>
+    </w:p>
+    <w:p>
+      <w:pPr>
+        <w:rPr>
+          <w:rFonts w:ascii="Robo" w:eastAsia="Calibri" w:hAnsi="Robo"/>
+          <w:color w:val="000000"/>
+          <w:u w:color="000000"/>
+          <w:lang w:eastAsia="zh-CN"/>
+        </w:rPr>
+      </w:pPr>
+      <w:r>
+        <w:rPr>
+          <w:rFonts w:ascii="Robo" w:eastAsia="Calibri" w:hAnsi="Robo"/>
+          <w:color w:val="000000"/>
+          <w:u w:color="000000"/>
+          <w:lang w:eastAsia="zh-CN"/>
+        </w:rPr>
+        <w:br w:type="page"/>
+      </w:r>
+    </w:p>
+    <w:p>
+      <w:pPr>
+        <w:rPr>
+          <w:rFonts w:ascii="Robo" w:eastAsia="Calibri" w:hAnsi="Robo"/>
+          <w:b/>
+          <w:bCs/>
+          <w:color w:val="000000"/>
+          <w:u w:color="000000"/>
+          <w:lang w:eastAsia="zh-CN"/>
+        </w:rPr>
+      </w:pPr>
+      <w:r>
+        <w:rPr>
+          <w:rFonts w:ascii="Robo" w:eastAsia="Calibri" w:hAnsi="Robo"/>
+          <w:b/>
+          <w:bCs/>
+          <w:color w:val="000000"/>
+          <w:u w:color="000000"/>
+          <w:lang w:eastAsia="zh-CN"/>
+        </w:rPr>
+        <w:lastRenderedPageBreak/>
+        <w:t>Step 6 – Understanding the modifications on canny_local.c with pthread</w:t>
+      </w:r>
+    </w:p>
+    <w:p>
+      <w:pPr>
+        <w:rPr>
+          <w:rFonts w:ascii="Robo" w:eastAsia="Calibri" w:hAnsi="Robo"/>
+          <w:b/>
+          <w:bCs/>
+          <w:color w:val="000000"/>
+          <w:u w:color="000000"/>
+          <w:lang w:eastAsia="zh-CN"/>
+        </w:rPr>
+      </w:pPr>
+    </w:p>
+    <w:tbl>
+      <w:tblPr>
+        <w:tblStyle w:val="af2"/>
+        <w:tblW w:w="0" w:type="auto"/>
+        <w:tblLook w:val="04A0" w:firstRow="1" w:lastRow="0" w:firstColumn="1" w:lastColumn="0" w:noHBand="0" w:noVBand="1"/>
+      </w:tblPr>
+      <w:tblGrid>
+        <w:gridCol w:w="5240"/>
+        <w:gridCol w:w="4110"/>
+      </w:tblGrid>
+      <w:tr>
+        <w:tc>
+          <w:tcPr>
+            <w:tcW w:w="5240" w:type="dxa"/>
+          </w:tcPr>
+          <w:p>
+            <w:pPr>
+              <w:pBdr>
+                <w:top w:val="none" w:sz="0" w:space="0" w:color="auto"/>
+                <w:left w:val="none" w:sz="0" w:space="0" w:color="auto"/>
+                <w:bottom w:val="none" w:sz="0" w:space="0" w:color="auto"/>
+                <w:right w:val="none" w:sz="0" w:space="0" w:color="auto"/>
+                <w:between w:val="none" w:sz="0" w:space="0" w:color="auto"/>
+                <w:bar w:val="none" w:sz="0" w:color="auto"/>
+              </w:pBdr>
+              <w:jc w:val="center"/>
+              <w:rPr>
+                <w:rFonts w:ascii="Robo" w:hAnsi="Robo"/>
+                <w:b/>
+                <w:bCs/>
+                <w:sz w:val="32"/>
+                <w:szCs w:val="32"/>
+              </w:rPr>
+            </w:pPr>
+            <w:r>
+              <w:rPr>
+                <w:rFonts w:ascii="Robo" w:hAnsi="Robo"/>
+                <w:b/>
+                <w:bCs/>
+                <w:sz w:val="32"/>
+                <w:szCs w:val="32"/>
+              </w:rPr>
+              <w:t>canny_local_</w:t>
+            </w:r>
+            <w:r>
+              <w:rPr>
+                <w:rFonts w:ascii="Robo" w:hAnsi="Robo"/>
+                <w:b/>
+                <w:bCs/>
+                <w:sz w:val="32"/>
+                <w:szCs w:val="32"/>
+              </w:rPr>
+              <w:t>pthread</w:t>
+            </w:r>
+            <w:r>
+              <w:rPr>
+                <w:rFonts w:ascii="Robo" w:hAnsi="Robo"/>
+                <w:b/>
+                <w:bCs/>
+                <w:sz w:val="32"/>
+                <w:szCs w:val="32"/>
+              </w:rPr>
+              <w:t>.c</w:t>
+            </w:r>
+          </w:p>
+        </w:tc>
+        <w:tc>
+          <w:tcPr>
+            <w:tcW w:w="4110" w:type="dxa"/>
+          </w:tcPr>
+          <w:p>
+            <w:pPr>
+              <w:pBdr>
+                <w:top w:val="none" w:sz="0" w:space="0" w:color="auto"/>
+                <w:left w:val="none" w:sz="0" w:space="0" w:color="auto"/>
+                <w:bottom w:val="none" w:sz="0" w:space="0" w:color="auto"/>
+                <w:right w:val="none" w:sz="0" w:space="0" w:color="auto"/>
+                <w:between w:val="none" w:sz="0" w:space="0" w:color="auto"/>
+                <w:bar w:val="none" w:sz="0" w:color="auto"/>
+              </w:pBdr>
+              <w:jc w:val="center"/>
+              <w:rPr>
+                <w:rFonts w:ascii="Robo" w:hAnsi="Robo"/>
+                <w:b/>
+                <w:bCs/>
+                <w:sz w:val="32"/>
+                <w:szCs w:val="32"/>
+              </w:rPr>
+            </w:pPr>
+            <w:r>
+              <w:rPr>
+                <w:rFonts w:ascii="Robo" w:hAnsi="Robo"/>
+                <w:b/>
+                <w:bCs/>
+                <w:sz w:val="32"/>
+                <w:szCs w:val="32"/>
+              </w:rPr>
+              <w:t>canny_local_.c</w:t>
+            </w:r>
+          </w:p>
+        </w:tc>
+      </w:tr>
+      <w:tr>
+        <w:tc>
+          <w:tcPr>
+            <w:tcW w:w="5240" w:type="dxa"/>
+          </w:tcPr>
+          <w:p>
+            <w:pPr>
+              <w:pBdr>
+                <w:top w:val="none" w:sz="0" w:space="0" w:color="auto"/>
+                <w:left w:val="none" w:sz="0" w:space="0" w:color="auto"/>
+                <w:bottom w:val="none" w:sz="0" w:space="0" w:color="auto"/>
+                <w:right w:val="none" w:sz="0" w:space="0" w:color="auto"/>
+                <w:between w:val="none" w:sz="0" w:space="0" w:color="auto"/>
+                <w:bar w:val="none" w:sz="0" w:color="auto"/>
+              </w:pBdr>
+              <w:rPr>
+                <w:rFonts w:ascii="Robo" w:hAnsi="Robo"/>
+              </w:rPr>
+            </w:pPr>
+            <w:r>
+              <w:rPr>
+                <w:rFonts w:ascii="Robo" w:hAnsi="Robo"/>
+              </w:rPr>
+              <w:drawing>
+                <wp:inline distT="0" distB="0" distL="0" distR="0" wp14:anchorId="02B50587" wp14:editId="41148238">
+                  <wp:extent cx="1947862" cy="999162"/>
+                  <wp:effectExtent l="0" t="0" r="0" b="0"/>
+                  <wp:docPr id="1335618939" name="圖片 1"/>
+                  <wp:cNvGraphicFramePr>
+                    <a:graphicFrameLocks xmlns:a="http://schemas.openxmlformats.org/drawingml/2006/main" noChangeAspect="1"/>
+                  </wp:cNvGraphicFramePr>
+                  <a:graphic xmlns:a="http://schemas.openxmlformats.org/drawingml/2006/main">
+                    <a:graphicData uri="http://schemas.openxmlformats.org/drawingml/2006/picture">
+                      <pic:pic xmlns:pic="http://schemas.openxmlformats.org/drawingml/2006/picture">
+                        <pic:nvPicPr>
+                          <pic:cNvPr id="1335618939" name=""/>
+                          <pic:cNvPicPr/>
+                        </pic:nvPicPr>
+                        <pic:blipFill>
+                          <a:blip r:embed="rId14"/>
+                          <a:stretch>
+                            <a:fillRect/>
+                          </a:stretch>
+                        </pic:blipFill>
+                        <pic:spPr>
+                          <a:xfrm>
+                            <a:off x="0" y="0"/>
+                            <a:ext cx="1951725" cy="1001144"/>
+                          </a:xfrm>
+                          <a:prstGeom prst="rect">
+                            <a:avLst/>
+                          </a:prstGeom>
+                        </pic:spPr>
+                      </pic:pic>
+                    </a:graphicData>
+                  </a:graphic>
+                </wp:inline>
+              </w:drawing>
+            </w:r>
+          </w:p>
+          <w:p>
+            <w:pPr>
+              <w:pBdr>
+                <w:top w:val="none" w:sz="0" w:space="0" w:color="auto"/>
+                <w:left w:val="none" w:sz="0" w:space="0" w:color="auto"/>
+                <w:bottom w:val="none" w:sz="0" w:space="0" w:color="auto"/>
+                <w:right w:val="none" w:sz="0" w:space="0" w:color="auto"/>
+                <w:between w:val="none" w:sz="0" w:space="0" w:color="auto"/>
+                <w:bar w:val="none" w:sz="0" w:color="auto"/>
+              </w:pBdr>
+              <w:rPr>
+                <w:rFonts w:ascii="Robo" w:hAnsi="Robo"/>
+              </w:rPr>
+            </w:pPr>
+            <w:r>
+              <w:rPr>
+                <w:rFonts w:ascii="Robo" w:hAnsi="Robo"/>
+              </w:rPr>
+              <w:t>Structure is created for passing arguments for multithreading</w:t>
+            </w:r>
+          </w:p>
+          <w:p>
+            <w:pPr>
+              <w:pBdr>
+                <w:top w:val="none" w:sz="0" w:space="0" w:color="auto"/>
+                <w:left w:val="none" w:sz="0" w:space="0" w:color="auto"/>
+                <w:bottom w:val="none" w:sz="0" w:space="0" w:color="auto"/>
+                <w:right w:val="none" w:sz="0" w:space="0" w:color="auto"/>
+                <w:between w:val="none" w:sz="0" w:space="0" w:color="auto"/>
+                <w:bar w:val="none" w:sz="0" w:color="auto"/>
+              </w:pBdr>
+              <w:rPr>
+                <w:rFonts w:ascii="Robo" w:hAnsi="Robo"/>
+              </w:rPr>
+            </w:pPr>
+          </w:p>
+        </w:tc>
+        <w:tc>
+          <w:tcPr>
+            <w:tcW w:w="4110" w:type="dxa"/>
+          </w:tcPr>
+          <w:p>
+            <w:pPr>
+              <w:pBdr>
+                <w:top w:val="none" w:sz="0" w:space="0" w:color="auto"/>
+                <w:left w:val="none" w:sz="0" w:space="0" w:color="auto"/>
+                <w:bottom w:val="none" w:sz="0" w:space="0" w:color="auto"/>
+                <w:right w:val="none" w:sz="0" w:space="0" w:color="auto"/>
+                <w:between w:val="none" w:sz="0" w:space="0" w:color="auto"/>
+                <w:bar w:val="none" w:sz="0" w:color="auto"/>
+              </w:pBdr>
+              <w:rPr>
+                <w:rFonts w:ascii="Robo" w:hAnsi="Robo"/>
+              </w:rPr>
+            </w:pPr>
+            <w:r>
+              <w:rPr>
+                <w:rFonts w:ascii="Robo" w:hAnsi="Robo"/>
+              </w:rPr>
+              <w:t>None</w:t>
+            </w:r>
+          </w:p>
+        </w:tc>
+      </w:tr>
+      <w:tr>
+        <w:tc>
+          <w:tcPr>
+            <w:tcW w:w="5240" w:type="dxa"/>
+          </w:tcPr>
+          <w:p>
+            <w:pPr>
+              <w:pBdr>
+                <w:top w:val="none" w:sz="0" w:space="0" w:color="auto"/>
+                <w:left w:val="none" w:sz="0" w:space="0" w:color="auto"/>
+                <w:bottom w:val="none" w:sz="0" w:space="0" w:color="auto"/>
+                <w:right w:val="none" w:sz="0" w:space="0" w:color="auto"/>
+                <w:between w:val="none" w:sz="0" w:space="0" w:color="auto"/>
+                <w:bar w:val="none" w:sz="0" w:color="auto"/>
+              </w:pBdr>
+              <w:rPr>
+                <w:rFonts w:ascii="Robo" w:hAnsi="Robo"/>
+              </w:rPr>
+            </w:pPr>
+            <w:r>
+              <w:rPr>
+                <w:rFonts w:ascii="Robo" w:hAnsi="Robo"/>
+              </w:rPr>
+              <w:drawing>
+                <wp:inline distT="0" distB="0" distL="0" distR="0" wp14:anchorId="5EDAAC5A" wp14:editId="027951FD">
+                  <wp:extent cx="2305050" cy="1795526"/>
+                  <wp:effectExtent l="0" t="0" r="0" b="0"/>
+                  <wp:docPr id="1760214900" name="圖片 1"/>
+                  <wp:cNvGraphicFramePr>
+                    <a:graphicFrameLocks xmlns:a="http://schemas.openxmlformats.org/drawingml/2006/main" noChangeAspect="1"/>
+                  </wp:cNvGraphicFramePr>
+                  <a:graphic xmlns:a="http://schemas.openxmlformats.org/drawingml/2006/main">
+                    <a:graphicData uri="http://schemas.openxmlformats.org/drawingml/2006/picture">
+                      <pic:pic xmlns:pic="http://schemas.openxmlformats.org/drawingml/2006/picture">
+                        <pic:nvPicPr>
+                          <pic:cNvPr id="1760214900" name=""/>
+                          <pic:cNvPicPr/>
+                        </pic:nvPicPr>
+                        <pic:blipFill>
+                          <a:blip r:embed="rId15"/>
+                          <a:stretch>
+                            <a:fillRect/>
+                          </a:stretch>
+                        </pic:blipFill>
+                        <pic:spPr>
+                          <a:xfrm>
+                            <a:off x="0" y="0"/>
+                            <a:ext cx="2314375" cy="1802790"/>
+                          </a:xfrm>
+                          <a:prstGeom prst="rect">
+                            <a:avLst/>
+                          </a:prstGeom>
+                        </pic:spPr>
+                      </pic:pic>
+                    </a:graphicData>
+                  </a:graphic>
+                </wp:inline>
+              </w:drawing>
+            </w:r>
+          </w:p>
+          <w:p>
+            <w:pPr>
+              <w:pBdr>
+                <w:top w:val="none" w:sz="0" w:space="0" w:color="auto"/>
+                <w:left w:val="none" w:sz="0" w:space="0" w:color="auto"/>
+                <w:bottom w:val="none" w:sz="0" w:space="0" w:color="auto"/>
+                <w:right w:val="none" w:sz="0" w:space="0" w:color="auto"/>
+                <w:between w:val="none" w:sz="0" w:space="0" w:color="auto"/>
+                <w:bar w:val="none" w:sz="0" w:color="auto"/>
+              </w:pBdr>
+              <w:rPr>
+                <w:rFonts w:ascii="Robo" w:hAnsi="Robo"/>
+              </w:rPr>
+            </w:pPr>
+            <w:r>
+              <w:rPr>
+                <w:rFonts w:ascii="Robo" w:hAnsi="Robo"/>
+              </w:rPr>
+              <w:t>blur_x</w:t>
+            </w:r>
+            <w:r>
+              <w:rPr>
+                <w:rFonts w:ascii="Robo" w:hAnsi="Robo"/>
+              </w:rPr>
+              <w:t xml:space="preserve"> is modified to take argument and </w:t>
+            </w:r>
+            <w:r>
+              <w:rPr>
+                <w:rFonts w:ascii="Robo" w:hAnsi="Robo"/>
+              </w:rPr>
+              <w:t>have local variables declared with init value from the argument,</w:t>
+            </w:r>
+          </w:p>
+        </w:tc>
+        <w:tc>
+          <w:tcPr>
+            <w:tcW w:w="4110" w:type="dxa"/>
+          </w:tcPr>
+          <w:p>
+            <w:pPr>
+              <w:pBdr>
+                <w:top w:val="none" w:sz="0" w:space="0" w:color="auto"/>
+                <w:left w:val="none" w:sz="0" w:space="0" w:color="auto"/>
+                <w:bottom w:val="none" w:sz="0" w:space="0" w:color="auto"/>
+                <w:right w:val="none" w:sz="0" w:space="0" w:color="auto"/>
+                <w:between w:val="none" w:sz="0" w:space="0" w:color="auto"/>
+                <w:bar w:val="none" w:sz="0" w:color="auto"/>
+              </w:pBdr>
+              <w:rPr>
+                <w:rFonts w:ascii="Robo" w:hAnsi="Robo"/>
+              </w:rPr>
+            </w:pPr>
+            <w:r>
+              <w:rPr>
+                <w:rFonts w:ascii="Robo" w:hAnsi="Robo"/>
+              </w:rPr>
+              <w:t>None</w:t>
+            </w:r>
+          </w:p>
+        </w:tc>
+      </w:tr>
+      <w:tr>
+        <w:tc>
+          <w:tcPr>
+            <w:tcW w:w="5240" w:type="dxa"/>
+          </w:tcPr>
+          <w:p>
+            <w:pPr>
+              <w:pBdr>
+                <w:top w:val="none" w:sz="0" w:space="0" w:color="auto"/>
+                <w:left w:val="none" w:sz="0" w:space="0" w:color="auto"/>
+                <w:bottom w:val="none" w:sz="0" w:space="0" w:color="auto"/>
+                <w:right w:val="none" w:sz="0" w:space="0" w:color="auto"/>
+                <w:between w:val="none" w:sz="0" w:space="0" w:color="auto"/>
+                <w:bar w:val="none" w:sz="0" w:color="auto"/>
+              </w:pBdr>
+              <w:rPr>
+                <w:rFonts w:ascii="Robo" w:hAnsi="Robo"/>
+              </w:rPr>
+            </w:pPr>
+            <w:r>
+              <w:rPr>
+                <w:rFonts w:ascii="Robo" w:hAnsi="Robo"/>
+              </w:rPr>
+              <w:drawing>
+                <wp:inline distT="0" distB="0" distL="0" distR="0" wp14:anchorId="06AD91AA" wp14:editId="68C64E71">
+                  <wp:extent cx="2962275" cy="275744"/>
+                  <wp:effectExtent l="0" t="0" r="0" b="0"/>
+                  <wp:docPr id="919788170" name="圖片 1"/>
+                  <wp:cNvGraphicFramePr>
+                    <a:graphicFrameLocks xmlns:a="http://schemas.openxmlformats.org/drawingml/2006/main" noChangeAspect="1"/>
+                  </wp:cNvGraphicFramePr>
+                  <a:graphic xmlns:a="http://schemas.openxmlformats.org/drawingml/2006/main">
+                    <a:graphicData uri="http://schemas.openxmlformats.org/drawingml/2006/picture">
+                      <pic:pic xmlns:pic="http://schemas.openxmlformats.org/drawingml/2006/picture">
+                        <pic:nvPicPr>
+                          <pic:cNvPr id="919788170" name=""/>
+                          <pic:cNvPicPr/>
+                        </pic:nvPicPr>
+                        <pic:blipFill>
+                          <a:blip r:embed="rId16"/>
+                          <a:stretch>
+                            <a:fillRect/>
+                          </a:stretch>
+                        </pic:blipFill>
+                        <pic:spPr>
+                          <a:xfrm>
+                            <a:off x="0" y="0"/>
+                            <a:ext cx="2992436" cy="278552"/>
+                          </a:xfrm>
+                          <a:prstGeom prst="rect">
+                            <a:avLst/>
+                          </a:prstGeom>
+                        </pic:spPr>
+                      </pic:pic>
+                    </a:graphicData>
+                  </a:graphic>
+                </wp:inline>
+              </w:drawing>
+            </w:r>
+          </w:p>
+          <w:p>
+            <w:pPr>
+              <w:pBdr>
+                <w:top w:val="none" w:sz="0" w:space="0" w:color="auto"/>
+                <w:left w:val="none" w:sz="0" w:space="0" w:color="auto"/>
+                <w:bottom w:val="none" w:sz="0" w:space="0" w:color="auto"/>
+                <w:right w:val="none" w:sz="0" w:space="0" w:color="auto"/>
+                <w:between w:val="none" w:sz="0" w:space="0" w:color="auto"/>
+                <w:bar w:val="none" w:sz="0" w:color="auto"/>
+              </w:pBdr>
+              <w:rPr>
+                <w:rFonts w:ascii="Robo" w:hAnsi="Robo"/>
+              </w:rPr>
+            </w:pPr>
+            <w:r>
+              <w:rPr>
+                <w:rFonts w:ascii="Robo" w:hAnsi="Robo"/>
+              </w:rPr>
+              <w:t>Number of thread is defined as 4</w:t>
+            </w:r>
+          </w:p>
+        </w:tc>
+        <w:tc>
+          <w:tcPr>
+            <w:tcW w:w="4110" w:type="dxa"/>
+          </w:tcPr>
+          <w:p>
+            <w:pPr>
+              <w:pBdr>
+                <w:top w:val="none" w:sz="0" w:space="0" w:color="auto"/>
+                <w:left w:val="none" w:sz="0" w:space="0" w:color="auto"/>
+                <w:bottom w:val="none" w:sz="0" w:space="0" w:color="auto"/>
+                <w:right w:val="none" w:sz="0" w:space="0" w:color="auto"/>
+                <w:between w:val="none" w:sz="0" w:space="0" w:color="auto"/>
+                <w:bar w:val="none" w:sz="0" w:color="auto"/>
+              </w:pBdr>
+              <w:rPr>
+                <w:rFonts w:ascii="Robo" w:hAnsi="Robo"/>
+              </w:rPr>
+            </w:pPr>
+            <w:r>
+              <w:rPr>
+                <w:rFonts w:ascii="Robo" w:hAnsi="Robo"/>
+              </w:rPr>
+              <w:t>None</w:t>
+            </w:r>
+          </w:p>
+        </w:tc>
+      </w:tr>
+      <w:tr>
+        <w:tc>
+          <w:tcPr>
+            <w:tcW w:w="5240" w:type="dxa"/>
+          </w:tcPr>
+          <w:p>
+            <w:pPr>
+              <w:pBdr>
+                <w:top w:val="none" w:sz="0" w:space="0" w:color="auto"/>
+                <w:left w:val="none" w:sz="0" w:space="0" w:color="auto"/>
+                <w:bottom w:val="none" w:sz="0" w:space="0" w:color="auto"/>
+                <w:right w:val="none" w:sz="0" w:space="0" w:color="auto"/>
+                <w:between w:val="none" w:sz="0" w:space="0" w:color="auto"/>
+                <w:bar w:val="none" w:sz="0" w:color="auto"/>
+              </w:pBdr>
+              <w:rPr>
+                <w:rFonts w:ascii="Robo" w:hAnsi="Robo"/>
+              </w:rPr>
+            </w:pPr>
+            <w:r>
+              <w:rPr>
+                <w:rFonts w:ascii="Robo" w:hAnsi="Robo"/>
+              </w:rPr>
+              <w:drawing>
+                <wp:inline distT="0" distB="0" distL="0" distR="0" wp14:anchorId="5337350D" wp14:editId="2EC6C51A">
+                  <wp:extent cx="2797285" cy="1409700"/>
+                  <wp:effectExtent l="0" t="0" r="3175" b="0"/>
+                  <wp:docPr id="1779765078" name="圖片 1"/>
+                  <wp:cNvGraphicFramePr>
+                    <a:graphicFrameLocks xmlns:a="http://schemas.openxmlformats.org/drawingml/2006/main" noChangeAspect="1"/>
+                  </wp:cNvGraphicFramePr>
+                  <a:graphic xmlns:a="http://schemas.openxmlformats.org/drawingml/2006/main">
+                    <a:graphicData uri="http://schemas.openxmlformats.org/drawingml/2006/picture">
+                      <pic:pic xmlns:pic="http://schemas.openxmlformats.org/drawingml/2006/picture">
+                        <pic:nvPicPr>
+                          <pic:cNvPr id="1779765078" name=""/>
+                          <pic:cNvPicPr/>
+                        </pic:nvPicPr>
+                        <pic:blipFill>
+                          <a:blip r:embed="rId17"/>
+                          <a:stretch>
+                            <a:fillRect/>
+                          </a:stretch>
+                        </pic:blipFill>
+                        <pic:spPr>
+                          <a:xfrm>
+                            <a:off x="0" y="0"/>
+                            <a:ext cx="2804665" cy="1413419"/>
+                          </a:xfrm>
+                          <a:prstGeom prst="rect">
+                            <a:avLst/>
+                          </a:prstGeom>
+                        </pic:spPr>
+                      </pic:pic>
+                    </a:graphicData>
+                  </a:graphic>
+                </wp:inline>
+              </w:drawing>
+            </w:r>
+          </w:p>
+          <w:p>
+            <w:pPr>
+              <w:pBdr>
+                <w:top w:val="none" w:sz="0" w:space="0" w:color="auto"/>
+                <w:left w:val="none" w:sz="0" w:space="0" w:color="auto"/>
+                <w:bottom w:val="none" w:sz="0" w:space="0" w:color="auto"/>
+                <w:right w:val="none" w:sz="0" w:space="0" w:color="auto"/>
+                <w:between w:val="none" w:sz="0" w:space="0" w:color="auto"/>
+                <w:bar w:val="none" w:sz="0" w:color="auto"/>
+              </w:pBdr>
+              <w:rPr>
+                <w:rFonts w:ascii="Robo" w:hAnsi="Robo"/>
+              </w:rPr>
+            </w:pPr>
+            <w:r>
+              <w:rPr>
+                <w:rFonts w:ascii="Robo" w:hAnsi="Robo"/>
+              </w:rPr>
+              <w:t>In gaussian smooth, threads are created for BlurX and executed</w:t>
+            </w:r>
+          </w:p>
+        </w:tc>
+        <w:tc>
+          <w:tcPr>
+            <w:tcW w:w="4110" w:type="dxa"/>
+          </w:tcPr>
+          <w:p>
+            <w:pPr>
+              <w:pBdr>
+                <w:top w:val="none" w:sz="0" w:space="0" w:color="auto"/>
+                <w:left w:val="none" w:sz="0" w:space="0" w:color="auto"/>
+                <w:bottom w:val="none" w:sz="0" w:space="0" w:color="auto"/>
+                <w:right w:val="none" w:sz="0" w:space="0" w:color="auto"/>
+                <w:between w:val="none" w:sz="0" w:space="0" w:color="auto"/>
+                <w:bar w:val="none" w:sz="0" w:color="auto"/>
+              </w:pBdr>
+              <w:rPr>
+                <w:rFonts w:ascii="Robo" w:hAnsi="Robo"/>
+              </w:rPr>
+            </w:pPr>
+            <w:r>
+              <w:rPr>
+                <w:rFonts w:ascii="Robo" w:hAnsi="Robo"/>
+              </w:rPr>
+              <w:t>None</w:t>
+            </w:r>
+          </w:p>
+        </w:tc>
+      </w:tr>
+      <w:tr>
+        <w:tc>
+          <w:tcPr>
+            <w:tcW w:w="5240" w:type="dxa"/>
+          </w:tcPr>
+          <w:p>
+            <w:pPr>
+              <w:pBdr>
+                <w:top w:val="none" w:sz="0" w:space="0" w:color="auto"/>
+                <w:left w:val="none" w:sz="0" w:space="0" w:color="auto"/>
+                <w:bottom w:val="none" w:sz="0" w:space="0" w:color="auto"/>
+                <w:right w:val="none" w:sz="0" w:space="0" w:color="auto"/>
+                <w:between w:val="none" w:sz="0" w:space="0" w:color="auto"/>
+                <w:bar w:val="none" w:sz="0" w:color="auto"/>
+              </w:pBdr>
+              <w:rPr>
+                <w:rFonts w:ascii="Robo" w:hAnsi="Robo"/>
+              </w:rPr>
+            </w:pPr>
+            <w:r>
+              <w:rPr>
+                <w:rFonts w:ascii="Robo" w:hAnsi="Robo"/>
+              </w:rPr>
+              <w:drawing>
+                <wp:inline distT="0" distB="0" distL="0" distR="0" wp14:anchorId="07F66D81" wp14:editId="63322A7D">
+                  <wp:extent cx="2628900" cy="593623"/>
+                  <wp:effectExtent l="0" t="0" r="0" b="0"/>
+                  <wp:docPr id="151705996" name="圖片 1"/>
+                  <wp:cNvGraphicFramePr>
+                    <a:graphicFrameLocks xmlns:a="http://schemas.openxmlformats.org/drawingml/2006/main" noChangeAspect="1"/>
+                  </wp:cNvGraphicFramePr>
+                  <a:graphic xmlns:a="http://schemas.openxmlformats.org/drawingml/2006/main">
+                    <a:graphicData uri="http://schemas.openxmlformats.org/drawingml/2006/picture">
+                      <pic:pic xmlns:pic="http://schemas.openxmlformats.org/drawingml/2006/picture">
+                        <pic:nvPicPr>
+                          <pic:cNvPr id="151705996" name=""/>
+                          <pic:cNvPicPr/>
+                        </pic:nvPicPr>
+                        <pic:blipFill>
+                          <a:blip r:embed="rId18"/>
+                          <a:stretch>
+                            <a:fillRect/>
+                          </a:stretch>
+                        </pic:blipFill>
+                        <pic:spPr>
+                          <a:xfrm>
+                            <a:off x="0" y="0"/>
+                            <a:ext cx="2643248" cy="596863"/>
+                          </a:xfrm>
+                          <a:prstGeom prst="rect">
+                            <a:avLst/>
+                          </a:prstGeom>
+                        </pic:spPr>
+                      </pic:pic>
+                    </a:graphicData>
+                  </a:graphic>
+                </wp:inline>
+              </w:drawing>
+            </w:r>
+          </w:p>
+          <w:p>
+            <w:pPr>
+              <w:pBdr>
+                <w:top w:val="none" w:sz="0" w:space="0" w:color="auto"/>
+                <w:left w:val="none" w:sz="0" w:space="0" w:color="auto"/>
+                <w:bottom w:val="none" w:sz="0" w:space="0" w:color="auto"/>
+                <w:right w:val="none" w:sz="0" w:space="0" w:color="auto"/>
+                <w:between w:val="none" w:sz="0" w:space="0" w:color="auto"/>
+                <w:bar w:val="none" w:sz="0" w:color="auto"/>
+              </w:pBdr>
+              <w:rPr>
+                <w:rFonts w:ascii="Robo" w:hAnsi="Robo"/>
+              </w:rPr>
+            </w:pPr>
+            <w:r>
+              <w:rPr>
+                <w:rFonts w:ascii="Robo" w:hAnsi="Robo"/>
+              </w:rPr>
+              <w:t>Each thread are waited to join before process moves on.</w:t>
+            </w:r>
+          </w:p>
+        </w:tc>
+        <w:tc>
+          <w:tcPr>
+            <w:tcW w:w="4110" w:type="dxa"/>
+          </w:tcPr>
+          <w:p>
+            <w:pPr>
+              <w:pBdr>
+                <w:top w:val="none" w:sz="0" w:space="0" w:color="auto"/>
+                <w:left w:val="none" w:sz="0" w:space="0" w:color="auto"/>
+                <w:bottom w:val="none" w:sz="0" w:space="0" w:color="auto"/>
+                <w:right w:val="none" w:sz="0" w:space="0" w:color="auto"/>
+                <w:between w:val="none" w:sz="0" w:space="0" w:color="auto"/>
+                <w:bar w:val="none" w:sz="0" w:color="auto"/>
+              </w:pBdr>
+              <w:rPr>
+                <w:rFonts w:ascii="Robo" w:hAnsi="Robo"/>
+              </w:rPr>
+            </w:pPr>
+            <w:r>
+              <w:rPr>
+                <w:rFonts w:ascii="Robo" w:hAnsi="Robo"/>
+              </w:rPr>
+              <w:t>None</w:t>
+            </w:r>
+          </w:p>
+        </w:tc>
+      </w:tr>
+    </w:tbl>
+    <w:p>
+      <w:pPr>
+        <w:rPr>
+          <w:rFonts w:ascii="Robo" w:eastAsia="Calibri" w:hAnsi="Robo"/>
+          <w:b/>
+          <w:bCs/>
+          <w:color w:val="000000"/>
+          <w:u w:color="000000"/>
+          <w:lang w:eastAsia="zh-CN"/>
+        </w:rPr>
+      </w:pPr>
+    </w:p>
+    <w:p>
+      <w:pPr>
         <w:rPr>
           <w:rFonts w:ascii="Robo" w:eastAsia="Calibri" w:hAnsi="Robo"/>
           <w:color w:val="000000"/>
@@ -1670,6 +2832,7 @@
           <w:sz w:val="36"/>
           <w:szCs w:val="36"/>
         </w:rPr>
+        <w:lastRenderedPageBreak/>
         <w:t>Problems and Discussion</w:t>
       </w:r>
       <w:r>
@@ -1760,21 +2923,7 @@
         <w:rPr>
           <w:rFonts w:ascii="Robo" w:hAnsi="Robo"/>
         </w:rPr>
-        <w:t xml:space="preserve">by switching to </w:t>
-      </w:r>
-      <w:proofErr w:type="spellStart"/>
-      <w:r>
-        <w:rPr>
-          <w:rFonts w:ascii="Robo" w:hAnsi="Robo"/>
-        </w:rPr>
-        <w:t>libcamera</w:t>
-      </w:r>
-      <w:proofErr w:type="spellEnd"/>
-      <w:r>
-        <w:rPr>
-          <w:rFonts w:ascii="Robo" w:hAnsi="Robo"/>
-        </w:rPr>
-        <w:t>.</w:t>
+        <w:t>by switching to libcamera.</w:t>
       </w:r>
     </w:p>
     <w:p>
@@ -1870,7 +3019,6 @@
           <w:sz w:val="36"/>
           <w:szCs w:val="36"/>
         </w:rPr>
-        <w:lastRenderedPageBreak/>
         <w:t xml:space="preserve">Conclusion </w:t>
       </w:r>
       <w:r>
@@ -1953,21 +3101,7 @@
         <w:rPr>
           <w:rFonts w:ascii="Robo" w:hAnsi="Robo"/>
         </w:rPr>
-        <w:t>defines the magnitude of smoothing; &lt;</w:t>
-      </w:r>
-      <w:proofErr w:type="spellStart"/>
-      <w:r>
-        <w:rPr>
-          <w:rFonts w:ascii="Robo" w:hAnsi="Robo"/>
-        </w:rPr>
-        <w:t>tlow</w:t>
-      </w:r>
-      <w:proofErr w:type="spellEnd"/>
-      <w:r>
-        <w:rPr>
-          <w:rFonts w:ascii="Robo" w:hAnsi="Robo"/>
-        </w:rPr>
-        <w:t xml:space="preserve">&gt; defines the </w:t>
+        <w:t xml:space="preserve">defines the magnitude of smoothing; &lt;tlow&gt; defines the </w:t>
       </w:r>
       <w:r>
         <w:rPr>

</xml_diff>

<commit_message>
updating for camera_canny multithreading
</commit_message>
<xml_diff>
--- a/WEEK2/Embedded_SW_Project2_Report.docx
+++ b/WEEK2/Embedded_SW_Project2_Report.docx
@@ -3762,6 +3762,1919 @@
         </w:rPr>
         <w:br w:type="page"/>
       </w:r>
+    </w:p>
+    <w:p>
+      <w:pPr>
+        <w:rPr>
+          <w:rFonts w:ascii="Robo" w:hAnsi="Robo"/>
+          <w:b/>
+          <w:bCs/>
+          <w:color w:val="000000"/>
+          <w:u w:color="000000"/>
+          <w:lang w:eastAsia="zh-TW"/>
+        </w:rPr>
+      </w:pPr>
+      <w:r>
+        <w:rPr>
+          <w:rFonts w:ascii="Robo" w:hAnsi="Robo"/>
+          <w:b/>
+          <w:bCs/>
+          <w:color w:val="000000"/>
+          <w:u w:color="000000"/>
+          <w:lang w:eastAsia="zh-TW"/>
+        </w:rPr>
+        <w:lastRenderedPageBreak/>
+        <w:t xml:space="preserve">Step 8 – Modifying the Blur in the y - direction with </w:t>
+      </w:r>
+      <w:proofErr w:type="spellStart"/>
+      <w:r>
+        <w:rPr>
+          <w:rFonts w:ascii="Robo" w:hAnsi="Robo"/>
+          <w:b/>
+          <w:bCs/>
+          <w:color w:val="000000"/>
+          <w:u w:color="000000"/>
+          <w:lang w:eastAsia="zh-TW"/>
+        </w:rPr>
+        <w:t>pthreads</w:t>
+      </w:r>
+      <w:proofErr w:type="spellEnd"/>
+    </w:p>
+    <w:p>
+      <w:pPr>
+        <w:rPr>
+          <w:rFonts w:ascii="Robo" w:hAnsi="Robo"/>
+          <w:b/>
+          <w:bCs/>
+          <w:color w:val="000000"/>
+          <w:u w:color="000000"/>
+          <w:lang w:eastAsia="zh-TW"/>
+        </w:rPr>
+      </w:pPr>
+      <w:r>
+        <w:rPr>
+          <w:rFonts w:ascii="Robo" w:hAnsi="Robo"/>
+          <w:b/>
+          <w:bCs/>
+          <w:color w:val="000000"/>
+          <w:u w:color="000000"/>
+          <w:lang w:eastAsia="zh-TW"/>
+        </w:rPr>
+        <w:drawing>
+          <wp:inline distT="0" distB="0" distL="0" distR="0" wp14:anchorId="5AEDFA5D" wp14:editId="23470190">
+            <wp:extent cx="1833563" cy="1180447"/>
+            <wp:effectExtent l="0" t="0" r="0" b="1270"/>
+            <wp:docPr id="1791241723" name="圖片 1" descr="一張含有 文字, 螢幕擷取畫面, 軟體, 字型 的圖片&#10;&#10;AI 產生的內容可能不正確。"/>
+            <wp:cNvGraphicFramePr>
+              <a:graphicFrameLocks xmlns:a="http://schemas.openxmlformats.org/drawingml/2006/main" noChangeAspect="1"/>
+            </wp:cNvGraphicFramePr>
+            <a:graphic xmlns:a="http://schemas.openxmlformats.org/drawingml/2006/main">
+              <a:graphicData uri="http://schemas.openxmlformats.org/drawingml/2006/picture">
+                <pic:pic xmlns:pic="http://schemas.openxmlformats.org/drawingml/2006/picture">
+                  <pic:nvPicPr>
+                    <pic:cNvPr id="1791241723" name="圖片 1" descr="一張含有 文字, 螢幕擷取畫面, 軟體, 字型 的圖片&#10;&#10;AI 產生的內容可能不正確。"/>
+                    <pic:cNvPicPr/>
+                  </pic:nvPicPr>
+                  <pic:blipFill>
+                    <a:blip r:embed="rId20"/>
+                    <a:stretch>
+                      <a:fillRect/>
+                    </a:stretch>
+                  </pic:blipFill>
+                  <pic:spPr>
+                    <a:xfrm>
+                      <a:off x="0" y="0"/>
+                      <a:ext cx="1839866" cy="1184505"/>
+                    </a:xfrm>
+                    <a:prstGeom prst="rect">
+                      <a:avLst/>
+                    </a:prstGeom>
+                  </pic:spPr>
+                </pic:pic>
+              </a:graphicData>
+            </a:graphic>
+          </wp:inline>
+        </w:drawing>
+      </w:r>
+    </w:p>
+    <w:p>
+      <w:pPr>
+        <w:rPr>
+          <w:rFonts w:ascii="Robo" w:hAnsi="Robo"/>
+          <w:color w:val="000000"/>
+          <w:u w:color="000000"/>
+          <w:lang w:eastAsia="zh-TW"/>
+        </w:rPr>
+      </w:pPr>
+      <w:r>
+        <w:rPr>
+          <w:rFonts w:ascii="Robo" w:hAnsi="Robo"/>
+          <w:color w:val="000000"/>
+          <w:u w:color="000000"/>
+          <w:lang w:eastAsia="zh-TW"/>
+        </w:rPr>
+        <w:t>Argument</w:t>
+      </w:r>
+      <w:r>
+        <w:rPr>
+          <w:rFonts w:ascii="Robo" w:hAnsi="Robo"/>
+          <w:color w:val="000000"/>
+          <w:u w:color="000000"/>
+          <w:lang w:eastAsia="zh-TW"/>
+        </w:rPr>
+        <w:t>s</w:t>
+      </w:r>
+      <w:r>
+        <w:rPr>
+          <w:rFonts w:ascii="Robo" w:hAnsi="Robo"/>
+          <w:color w:val="000000"/>
+          <w:u w:color="000000"/>
+          <w:lang w:eastAsia="zh-TW"/>
+        </w:rPr>
+        <w:t xml:space="preserve"> added for </w:t>
+      </w:r>
+      <w:r>
+        <w:rPr>
+          <w:rFonts w:ascii="Robo" w:hAnsi="Robo"/>
+          <w:color w:val="000000"/>
+          <w:u w:color="000000"/>
+          <w:lang w:eastAsia="zh-TW"/>
+        </w:rPr>
+        <w:t>Blur Y use.</w:t>
+      </w:r>
+    </w:p>
+    <w:p>
+      <w:pPr>
+        <w:rPr>
+          <w:rFonts w:ascii="Robo" w:hAnsi="Robo"/>
+          <w:b/>
+          <w:bCs/>
+          <w:color w:val="000000"/>
+          <w:u w:color="000000"/>
+          <w:lang w:eastAsia="zh-TW"/>
+        </w:rPr>
+      </w:pPr>
+      <w:r>
+        <w:rPr>
+          <w:rFonts w:ascii="Robo" w:hAnsi="Robo"/>
+          <w:b/>
+          <w:bCs/>
+          <w:color w:val="000000"/>
+          <w:u w:color="000000"/>
+          <w:lang w:eastAsia="zh-TW"/>
+        </w:rPr>
+        <w:drawing>
+          <wp:inline distT="0" distB="0" distL="0" distR="0" wp14:anchorId="6692EA68" wp14:editId="56F2716F">
+            <wp:extent cx="3275067" cy="2767012"/>
+            <wp:effectExtent l="0" t="0" r="1905" b="0"/>
+            <wp:docPr id="1434784079" name="圖片 1" descr="一張含有 文字, 螢幕擷取畫面, 數字, 陳列 的圖片&#10;&#10;AI 產生的內容可能不正確。"/>
+            <wp:cNvGraphicFramePr>
+              <a:graphicFrameLocks xmlns:a="http://schemas.openxmlformats.org/drawingml/2006/main" noChangeAspect="1"/>
+            </wp:cNvGraphicFramePr>
+            <a:graphic xmlns:a="http://schemas.openxmlformats.org/drawingml/2006/main">
+              <a:graphicData uri="http://schemas.openxmlformats.org/drawingml/2006/picture">
+                <pic:pic xmlns:pic="http://schemas.openxmlformats.org/drawingml/2006/picture">
+                  <pic:nvPicPr>
+                    <pic:cNvPr id="1434784079" name="圖片 1" descr="一張含有 文字, 螢幕擷取畫面, 數字, 陳列 的圖片&#10;&#10;AI 產生的內容可能不正確。"/>
+                    <pic:cNvPicPr/>
+                  </pic:nvPicPr>
+                  <pic:blipFill>
+                    <a:blip r:embed="rId21"/>
+                    <a:stretch>
+                      <a:fillRect/>
+                    </a:stretch>
+                  </pic:blipFill>
+                  <pic:spPr>
+                    <a:xfrm>
+                      <a:off x="0" y="0"/>
+                      <a:ext cx="3282894" cy="2773625"/>
+                    </a:xfrm>
+                    <a:prstGeom prst="rect">
+                      <a:avLst/>
+                    </a:prstGeom>
+                  </pic:spPr>
+                </pic:pic>
+              </a:graphicData>
+            </a:graphic>
+          </wp:inline>
+        </w:drawing>
+      </w:r>
+    </w:p>
+    <w:p>
+      <w:pPr>
+        <w:rPr>
+          <w:rFonts w:ascii="Robo" w:hAnsi="Robo"/>
+          <w:color w:val="000000"/>
+          <w:u w:color="000000"/>
+          <w:lang w:eastAsia="zh-TW"/>
+        </w:rPr>
+      </w:pPr>
+      <w:r>
+        <w:rPr>
+          <w:rFonts w:ascii="Robo" w:hAnsi="Robo"/>
+          <w:color w:val="000000"/>
+          <w:u w:color="000000"/>
+          <w:lang w:eastAsia="zh-TW"/>
+        </w:rPr>
+        <w:t xml:space="preserve">Blur Y </w:t>
+      </w:r>
+      <w:proofErr w:type="spellStart"/>
+      <w:r>
+        <w:rPr>
+          <w:rFonts w:ascii="Robo" w:hAnsi="Robo"/>
+          <w:color w:val="000000"/>
+          <w:u w:color="000000"/>
+          <w:lang w:eastAsia="zh-TW"/>
+        </w:rPr>
+        <w:t>seperated</w:t>
+      </w:r>
+      <w:proofErr w:type="spellEnd"/>
+      <w:r>
+        <w:rPr>
+          <w:rFonts w:ascii="Robo" w:hAnsi="Robo"/>
+          <w:color w:val="000000"/>
+          <w:u w:color="000000"/>
+          <w:lang w:eastAsia="zh-TW"/>
+        </w:rPr>
+        <w:t xml:space="preserve"> </w:t>
+      </w:r>
+      <w:r>
+        <w:rPr>
+          <w:rFonts w:ascii="Robo" w:hAnsi="Robo"/>
+          <w:color w:val="000000"/>
+          <w:u w:color="000000"/>
+          <w:lang w:eastAsia="zh-TW"/>
+        </w:rPr>
+        <w:t xml:space="preserve">for </w:t>
+      </w:r>
+      <w:r>
+        <w:rPr>
+          <w:rFonts w:ascii="Robo" w:hAnsi="Robo"/>
+          <w:color w:val="000000"/>
+          <w:u w:color="000000"/>
+          <w:lang w:eastAsia="zh-TW"/>
+        </w:rPr>
+        <w:t>multithreading.</w:t>
+      </w:r>
+      <w:r>
+        <w:rPr>
+          <w:rFonts w:ascii="Robo" w:hAnsi="Robo"/>
+          <w:color w:val="000000"/>
+          <w:u w:color="000000"/>
+          <w:lang w:eastAsia="zh-TW"/>
+        </w:rPr>
+        <w:t xml:space="preserve"> </w:t>
+      </w:r>
+      <w:r>
+        <w:rPr>
+          <w:rFonts w:ascii="Robo" w:hAnsi="Robo"/>
+          <w:color w:val="000000"/>
+          <w:u w:color="000000"/>
+          <w:lang w:eastAsia="zh-TW"/>
+        </w:rPr>
+        <w:t xml:space="preserve">Iteration on rows, so we modified the for loops as </w:t>
+      </w:r>
+      <w:proofErr w:type="gramStart"/>
+      <w:r>
+        <w:rPr>
+          <w:rFonts w:ascii="Robo" w:hAnsi="Robo"/>
+          <w:color w:val="000000"/>
+          <w:u w:color="000000"/>
+          <w:lang w:eastAsia="zh-TW"/>
+        </w:rPr>
+        <w:t>cols</w:t>
+      </w:r>
+      <w:proofErr w:type="gramEnd"/>
+      <w:r>
+        <w:rPr>
+          <w:rFonts w:ascii="Robo" w:hAnsi="Robo"/>
+          <w:color w:val="000000"/>
+          <w:u w:color="000000"/>
+          <w:lang w:eastAsia="zh-TW"/>
+        </w:rPr>
+        <w:t xml:space="preserve"> in the inner loop.</w:t>
+      </w:r>
+    </w:p>
+    <w:p>
+      <w:pPr>
+        <w:rPr>
+          <w:rFonts w:ascii="Robo" w:hAnsi="Robo"/>
+          <w:color w:val="000000"/>
+          <w:u w:color="000000"/>
+          <w:lang w:eastAsia="zh-TW"/>
+        </w:rPr>
+      </w:pPr>
+      <w:r>
+        <w:rPr>
+          <w:rFonts w:ascii="Robo" w:hAnsi="Robo"/>
+          <w:color w:val="000000"/>
+          <w:u w:color="000000"/>
+          <w:lang w:eastAsia="zh-TW"/>
+        </w:rPr>
+        <w:drawing>
+          <wp:inline distT="0" distB="0" distL="0" distR="0" wp14:anchorId="6554E3AA" wp14:editId="0396BF37">
+            <wp:extent cx="3310128" cy="2133194"/>
+            <wp:effectExtent l="0" t="0" r="5080" b="635"/>
+            <wp:docPr id="1535424016" name="圖片 1" descr="一張含有 文字, 螢幕擷取畫面, 軟體, 數字 的圖片&#10;&#10;AI 產生的內容可能不正確。"/>
+            <wp:cNvGraphicFramePr>
+              <a:graphicFrameLocks xmlns:a="http://schemas.openxmlformats.org/drawingml/2006/main" noChangeAspect="1"/>
+            </wp:cNvGraphicFramePr>
+            <a:graphic xmlns:a="http://schemas.openxmlformats.org/drawingml/2006/main">
+              <a:graphicData uri="http://schemas.openxmlformats.org/drawingml/2006/picture">
+                <pic:pic xmlns:pic="http://schemas.openxmlformats.org/drawingml/2006/picture">
+                  <pic:nvPicPr>
+                    <pic:cNvPr id="1535424016" name="圖片 1" descr="一張含有 文字, 螢幕擷取畫面, 軟體, 數字 的圖片&#10;&#10;AI 產生的內容可能不正確。"/>
+                    <pic:cNvPicPr/>
+                  </pic:nvPicPr>
+                  <pic:blipFill>
+                    <a:blip r:embed="rId22"/>
+                    <a:stretch>
+                      <a:fillRect/>
+                    </a:stretch>
+                  </pic:blipFill>
+                  <pic:spPr>
+                    <a:xfrm>
+                      <a:off x="0" y="0"/>
+                      <a:ext cx="3313813" cy="2135568"/>
+                    </a:xfrm>
+                    <a:prstGeom prst="rect">
+                      <a:avLst/>
+                    </a:prstGeom>
+                  </pic:spPr>
+                </pic:pic>
+              </a:graphicData>
+            </a:graphic>
+          </wp:inline>
+        </w:drawing>
+      </w:r>
+    </w:p>
+    <w:p>
+      <w:pPr>
+        <w:rPr>
+          <w:rFonts w:ascii="Robo" w:hAnsi="Robo"/>
+          <w:color w:val="000000"/>
+          <w:u w:color="000000"/>
+          <w:lang w:eastAsia="zh-TW"/>
+        </w:rPr>
+      </w:pPr>
+      <w:r>
+        <w:rPr>
+          <w:rFonts w:ascii="Robo" w:hAnsi="Robo"/>
+          <w:color w:val="000000"/>
+          <w:u w:color="000000"/>
+          <w:lang w:eastAsia="zh-TW"/>
+        </w:rPr>
+        <w:t>Threads created for Blur Y.</w:t>
+      </w:r>
+    </w:p>
+    <w:p>
+      <w:pPr>
+        <w:rPr>
+          <w:rFonts w:ascii="Robo" w:hAnsi="Robo"/>
+          <w:color w:val="000000"/>
+          <w:u w:color="000000"/>
+          <w:lang w:eastAsia="zh-TW"/>
+        </w:rPr>
+      </w:pPr>
+      <w:r>
+        <w:rPr>
+          <w:rFonts w:ascii="Robo" w:hAnsi="Robo"/>
+          <w:color w:val="000000"/>
+          <w:u w:color="000000"/>
+          <w:lang w:eastAsia="zh-TW"/>
+        </w:rPr>
+        <w:lastRenderedPageBreak/>
+        <w:drawing>
+          <wp:inline distT="0" distB="0" distL="0" distR="0" wp14:anchorId="334D4423" wp14:editId="66162311">
+            <wp:extent cx="3912435" cy="2681021"/>
+            <wp:effectExtent l="0" t="0" r="0" b="5080"/>
+            <wp:docPr id="435542928" name="圖片 1" descr="一張含有 文字, 螢幕擷取畫面, 軟體, 多媒體軟體 的圖片&#10;&#10;AI 產生的內容可能不正確。"/>
+            <wp:cNvGraphicFramePr>
+              <a:graphicFrameLocks xmlns:a="http://schemas.openxmlformats.org/drawingml/2006/main" noChangeAspect="1"/>
+            </wp:cNvGraphicFramePr>
+            <a:graphic xmlns:a="http://schemas.openxmlformats.org/drawingml/2006/main">
+              <a:graphicData uri="http://schemas.openxmlformats.org/drawingml/2006/picture">
+                <pic:pic xmlns:pic="http://schemas.openxmlformats.org/drawingml/2006/picture">
+                  <pic:nvPicPr>
+                    <pic:cNvPr id="435542928" name="圖片 1" descr="一張含有 文字, 螢幕擷取畫面, 軟體, 多媒體軟體 的圖片&#10;&#10;AI 產生的內容可能不正確。"/>
+                    <pic:cNvPicPr/>
+                  </pic:nvPicPr>
+                  <pic:blipFill>
+                    <a:blip r:embed="rId23"/>
+                    <a:stretch>
+                      <a:fillRect/>
+                    </a:stretch>
+                  </pic:blipFill>
+                  <pic:spPr>
+                    <a:xfrm>
+                      <a:off x="0" y="0"/>
+                      <a:ext cx="3916765" cy="2683988"/>
+                    </a:xfrm>
+                    <a:prstGeom prst="rect">
+                      <a:avLst/>
+                    </a:prstGeom>
+                  </pic:spPr>
+                </pic:pic>
+              </a:graphicData>
+            </a:graphic>
+          </wp:inline>
+        </w:drawing>
+      </w:r>
+    </w:p>
+    <w:p>
+      <w:pPr>
+        <w:rPr>
+          <w:rFonts w:ascii="Robo" w:hAnsi="Robo"/>
+          <w:color w:val="000000"/>
+          <w:u w:color="000000"/>
+          <w:lang w:eastAsia="zh-TW"/>
+        </w:rPr>
+      </w:pPr>
+      <w:r>
+        <w:rPr>
+          <w:rFonts w:ascii="Robo" w:hAnsi="Robo"/>
+          <w:color w:val="000000"/>
+          <w:u w:color="000000"/>
+          <w:lang w:eastAsia="zh-TW"/>
+        </w:rPr>
+        <w:t>Now from the snapshot, we can see the</w:t>
+      </w:r>
+      <w:r>
+        <w:rPr>
+          <w:rFonts w:ascii="Robo" w:hAnsi="Robo"/>
+          <w:color w:val="000000"/>
+          <w:u w:color="000000"/>
+          <w:lang w:eastAsia="zh-TW"/>
+        </w:rPr>
+        <w:t>re are 4 threads created for Blur Y</w:t>
+      </w:r>
+      <w:r>
+        <w:rPr>
+          <w:rFonts w:ascii="Robo" w:hAnsi="Robo"/>
+          <w:color w:val="000000"/>
+          <w:u w:color="000000"/>
+          <w:lang w:eastAsia="zh-TW"/>
+        </w:rPr>
+        <w:t>.</w:t>
+      </w:r>
+    </w:p>
+    <w:p>
+      <w:pPr>
+        <w:rPr>
+          <w:rFonts w:ascii="Robo" w:hAnsi="Robo"/>
+          <w:color w:val="000000"/>
+          <w:u w:color="000000"/>
+          <w:lang w:eastAsia="zh-TW"/>
+        </w:rPr>
+      </w:pPr>
+      <w:r>
+        <w:rPr>
+          <w:rFonts w:ascii="Robo" w:hAnsi="Robo"/>
+          <w:color w:val="000000"/>
+          <w:u w:color="000000"/>
+          <w:lang w:eastAsia="zh-TW"/>
+        </w:rPr>
+        <w:t>Time results are below:</w:t>
+      </w:r>
+    </w:p>
+    <w:p>
+      <w:pPr>
+        <w:rPr>
+          <w:rFonts w:ascii="Robo" w:hAnsi="Robo"/>
+          <w:b/>
+          <w:bCs/>
+          <w:color w:val="000000"/>
+          <w:u w:color="000000"/>
+          <w:lang w:eastAsia="zh-TW"/>
+        </w:rPr>
+      </w:pPr>
+      <w:r>
+        <w:rPr>
+          <w:rFonts w:ascii="Robo" w:eastAsia="Calibri" w:hAnsi="Robo"/>
+          <w:b/>
+          <w:bCs/>
+          <w:color w:val="000000"/>
+          <w:u w:color="000000"/>
+          <w:lang w:eastAsia="zh-CN"/>
+        </w:rPr>
+        <w:t>#canny_</w:t>
+      </w:r>
+      <w:r>
+        <w:rPr>
+          <w:rFonts w:ascii="Robo" w:hAnsi="Robo" w:hint="eastAsia"/>
+          <w:b/>
+          <w:bCs/>
+          <w:color w:val="000000"/>
+          <w:u w:color="000000"/>
+          <w:lang w:eastAsia="zh-TW"/>
+        </w:rPr>
+        <w:t>pthread</w:t>
+      </w:r>
+      <w:r>
+        <w:rPr>
+          <w:rFonts w:ascii="Robo" w:hAnsi="Robo"/>
+          <w:b/>
+          <w:bCs/>
+          <w:color w:val="000000"/>
+          <w:u w:color="000000"/>
+          <w:lang w:eastAsia="zh-TW"/>
+        </w:rPr>
+        <w:t xml:space="preserve"> X+Y</w:t>
+      </w:r>
+    </w:p>
+    <w:p>
+      <w:pPr>
+        <w:rPr>
+          <w:rFonts w:ascii="Robo" w:hAnsi="Robo"/>
+          <w:color w:val="000000"/>
+          <w:u w:color="000000"/>
+          <w:lang w:eastAsia="zh-TW"/>
+        </w:rPr>
+      </w:pPr>
+      <w:r>
+        <w:rPr>
+          <w:rFonts w:ascii="Robo" w:hAnsi="Robo"/>
+          <w:color w:val="000000"/>
+          <w:u w:color="000000"/>
+          <w:lang w:eastAsia="zh-TW"/>
+        </w:rPr>
+        <w:t>real</w:t>
+      </w:r>
+      <w:r>
+        <w:rPr>
+          <w:rFonts w:ascii="Robo" w:hAnsi="Robo"/>
+          <w:color w:val="000000"/>
+          <w:u w:color="000000"/>
+          <w:lang w:eastAsia="zh-TW"/>
+        </w:rPr>
+        <w:tab/>
+        <w:t>0m0.530s</w:t>
+      </w:r>
+    </w:p>
+    <w:p>
+      <w:pPr>
+        <w:rPr>
+          <w:rFonts w:ascii="Robo" w:hAnsi="Robo"/>
+          <w:color w:val="000000"/>
+          <w:u w:color="000000"/>
+          <w:lang w:eastAsia="zh-TW"/>
+        </w:rPr>
+      </w:pPr>
+      <w:r>
+        <w:rPr>
+          <w:rFonts w:ascii="Robo" w:hAnsi="Robo"/>
+          <w:color w:val="000000"/>
+          <w:u w:color="000000"/>
+          <w:lang w:eastAsia="zh-TW"/>
+        </w:rPr>
+        <w:t>user</w:t>
+      </w:r>
+      <w:r>
+        <w:rPr>
+          <w:rFonts w:ascii="Robo" w:hAnsi="Robo"/>
+          <w:color w:val="000000"/>
+          <w:u w:color="000000"/>
+          <w:lang w:eastAsia="zh-TW"/>
+        </w:rPr>
+        <w:tab/>
+        <w:t>0m0.779s</w:t>
+      </w:r>
+    </w:p>
+    <w:p>
+      <w:pPr>
+        <w:rPr>
+          <w:rFonts w:ascii="Robo" w:hAnsi="Robo"/>
+          <w:color w:val="000000"/>
+          <w:u w:color="000000"/>
+          <w:lang w:eastAsia="zh-TW"/>
+        </w:rPr>
+      </w:pPr>
+      <w:r>
+        <w:rPr>
+          <w:rFonts w:ascii="Robo" w:hAnsi="Robo"/>
+          <w:color w:val="000000"/>
+          <w:u w:color="000000"/>
+          <w:lang w:eastAsia="zh-TW"/>
+        </w:rPr>
+        <w:t>sys</w:t>
+      </w:r>
+      <w:r>
+        <w:rPr>
+          <w:rFonts w:ascii="Robo" w:hAnsi="Robo"/>
+          <w:color w:val="000000"/>
+          <w:u w:color="000000"/>
+          <w:lang w:eastAsia="zh-TW"/>
+        </w:rPr>
+        <w:tab/>
+        <w:t>0m0.032s</w:t>
+      </w:r>
+    </w:p>
+    <w:p>
+      <w:pPr>
+        <w:rPr>
+          <w:rFonts w:ascii="Robo" w:eastAsia="Calibri" w:hAnsi="Robo"/>
+          <w:b/>
+          <w:bCs/>
+          <w:color w:val="000000"/>
+          <w:u w:color="000000"/>
+          <w:lang w:eastAsia="zh-CN"/>
+        </w:rPr>
+      </w:pPr>
+      <w:r>
+        <w:rPr>
+          <w:rFonts w:ascii="Robo" w:eastAsia="Calibri" w:hAnsi="Robo"/>
+          <w:b/>
+          <w:bCs/>
+          <w:color w:val="000000"/>
+          <w:u w:color="000000"/>
+          <w:lang w:eastAsia="zh-CN"/>
+        </w:rPr>
+        <w:t>#canny_local_omp</w:t>
+      </w:r>
+    </w:p>
+    <w:p>
+      <w:pPr>
+        <w:jc w:val="both"/>
+        <w:rPr>
+          <w:rFonts w:ascii="Robo" w:eastAsia="Calibri" w:hAnsi="Robo"/>
+          <w:color w:val="000000"/>
+          <w:u w:color="000000"/>
+          <w:lang w:eastAsia="zh-CN"/>
+        </w:rPr>
+      </w:pPr>
+      <w:r>
+        <w:rPr>
+          <w:rFonts w:ascii="Robo" w:eastAsia="Calibri" w:hAnsi="Robo"/>
+          <w:color w:val="000000"/>
+          <w:u w:color="000000"/>
+          <w:lang w:eastAsia="zh-CN"/>
+        </w:rPr>
+        <w:t>real</w:t>
+      </w:r>
+      <w:r>
+        <w:rPr>
+          <w:rFonts w:ascii="Robo" w:eastAsia="Calibri" w:hAnsi="Robo"/>
+          <w:color w:val="000000"/>
+          <w:u w:color="000000"/>
+          <w:lang w:eastAsia="zh-CN"/>
+        </w:rPr>
+        <w:tab/>
+        <w:t>0m0.662s</w:t>
+      </w:r>
+    </w:p>
+    <w:p>
+      <w:pPr>
+        <w:jc w:val="both"/>
+        <w:rPr>
+          <w:rFonts w:ascii="Robo" w:eastAsia="Calibri" w:hAnsi="Robo"/>
+          <w:color w:val="000000"/>
+          <w:u w:color="000000"/>
+          <w:lang w:eastAsia="zh-CN"/>
+        </w:rPr>
+      </w:pPr>
+      <w:r>
+        <w:rPr>
+          <w:rFonts w:ascii="Robo" w:eastAsia="Calibri" w:hAnsi="Robo"/>
+          <w:color w:val="000000"/>
+          <w:u w:color="000000"/>
+          <w:lang w:eastAsia="zh-CN"/>
+        </w:rPr>
+        <w:t>user</w:t>
+      </w:r>
+      <w:r>
+        <w:rPr>
+          <w:rFonts w:ascii="Robo" w:eastAsia="Calibri" w:hAnsi="Robo"/>
+          <w:color w:val="000000"/>
+          <w:u w:color="000000"/>
+          <w:lang w:eastAsia="zh-CN"/>
+        </w:rPr>
+        <w:tab/>
+        <w:t>0m0.913s</w:t>
+      </w:r>
+    </w:p>
+    <w:p>
+      <w:pPr>
+        <w:jc w:val="both"/>
+        <w:rPr>
+          <w:rFonts w:ascii="Robo" w:eastAsia="Calibri" w:hAnsi="Robo"/>
+          <w:color w:val="000000"/>
+          <w:u w:color="000000"/>
+          <w:lang w:eastAsia="zh-CN"/>
+        </w:rPr>
+      </w:pPr>
+      <w:r>
+        <w:rPr>
+          <w:rFonts w:ascii="Robo" w:eastAsia="Calibri" w:hAnsi="Robo"/>
+          <w:color w:val="000000"/>
+          <w:u w:color="000000"/>
+          <w:lang w:eastAsia="zh-CN"/>
+        </w:rPr>
+        <w:t>sys</w:t>
+      </w:r>
+      <w:r>
+        <w:rPr>
+          <w:rFonts w:ascii="Robo" w:eastAsia="Calibri" w:hAnsi="Robo"/>
+          <w:color w:val="000000"/>
+          <w:u w:color="000000"/>
+          <w:lang w:eastAsia="zh-CN"/>
+        </w:rPr>
+        <w:tab/>
+        <w:t>0m0.044s</w:t>
+      </w:r>
+    </w:p>
+    <w:p>
+      <w:pPr>
+        <w:rPr>
+          <w:rFonts w:ascii="Robo" w:eastAsia="Calibri" w:hAnsi="Robo"/>
+          <w:b/>
+          <w:bCs/>
+          <w:color w:val="000000"/>
+          <w:u w:color="000000"/>
+          <w:lang w:eastAsia="zh-CN"/>
+        </w:rPr>
+      </w:pPr>
+      <w:r>
+        <w:rPr>
+          <w:rFonts w:ascii="Robo" w:eastAsia="Calibri" w:hAnsi="Robo"/>
+          <w:b/>
+          <w:bCs/>
+          <w:color w:val="000000"/>
+          <w:u w:color="000000"/>
+          <w:lang w:eastAsia="zh-CN"/>
+        </w:rPr>
+        <w:t>#canny_local</w:t>
+      </w:r>
+    </w:p>
+    <w:p>
+      <w:pPr>
+        <w:rPr>
+          <w:rFonts w:ascii="Robo" w:eastAsia="Calibri" w:hAnsi="Robo"/>
+          <w:color w:val="000000"/>
+          <w:u w:color="000000"/>
+          <w:lang w:eastAsia="zh-CN"/>
+        </w:rPr>
+      </w:pPr>
+      <w:r>
+        <w:rPr>
+          <w:rFonts w:ascii="Robo" w:eastAsia="Calibri" w:hAnsi="Robo"/>
+          <w:color w:val="000000"/>
+          <w:u w:color="000000"/>
+          <w:lang w:eastAsia="zh-CN"/>
+        </w:rPr>
+        <w:t>real</w:t>
+      </w:r>
+      <w:r>
+        <w:rPr>
+          <w:rFonts w:ascii="Robo" w:eastAsia="Calibri" w:hAnsi="Robo"/>
+          <w:color w:val="000000"/>
+          <w:u w:color="000000"/>
+          <w:lang w:eastAsia="zh-CN"/>
+        </w:rPr>
+        <w:tab/>
+        <w:t>0m0.992s</w:t>
+      </w:r>
+    </w:p>
+    <w:p>
+      <w:pPr>
+        <w:rPr>
+          <w:rFonts w:ascii="Robo" w:eastAsia="Calibri" w:hAnsi="Robo"/>
+          <w:color w:val="000000"/>
+          <w:u w:color="000000"/>
+          <w:lang w:eastAsia="zh-CN"/>
+        </w:rPr>
+      </w:pPr>
+      <w:r>
+        <w:rPr>
+          <w:rFonts w:ascii="Robo" w:eastAsia="Calibri" w:hAnsi="Robo"/>
+          <w:color w:val="000000"/>
+          <w:u w:color="000000"/>
+          <w:lang w:eastAsia="zh-CN"/>
+        </w:rPr>
+        <w:t>user</w:t>
+      </w:r>
+      <w:r>
+        <w:rPr>
+          <w:rFonts w:ascii="Robo" w:eastAsia="Calibri" w:hAnsi="Robo"/>
+          <w:color w:val="000000"/>
+          <w:u w:color="000000"/>
+          <w:lang w:eastAsia="zh-CN"/>
+        </w:rPr>
+        <w:tab/>
+        <w:t>0m0.902s</w:t>
+      </w:r>
+    </w:p>
+    <w:p>
+      <w:pPr>
+        <w:rPr>
+          <w:rFonts w:ascii="Robo" w:eastAsia="Calibri" w:hAnsi="Robo"/>
+          <w:color w:val="000000"/>
+          <w:u w:color="000000"/>
+          <w:lang w:eastAsia="zh-CN"/>
+        </w:rPr>
+      </w:pPr>
+      <w:r>
+        <w:rPr>
+          <w:rFonts w:ascii="Robo" w:eastAsia="Calibri" w:hAnsi="Robo"/>
+          <w:color w:val="000000"/>
+          <w:u w:color="000000"/>
+          <w:lang w:eastAsia="zh-CN"/>
+        </w:rPr>
+        <w:t>sys</w:t>
+      </w:r>
+      <w:r>
+        <w:rPr>
+          <w:rFonts w:ascii="Robo" w:eastAsia="Calibri" w:hAnsi="Robo"/>
+          <w:color w:val="000000"/>
+          <w:u w:color="000000"/>
+          <w:lang w:eastAsia="zh-CN"/>
+        </w:rPr>
+        <w:tab/>
+        <w:t>0m0.020s</w:t>
+      </w:r>
+    </w:p>
+    <w:p>
+      <w:pPr>
+        <w:rPr>
+          <w:rFonts w:ascii="Robo" w:hAnsi="Robo"/>
+          <w:color w:val="000000"/>
+          <w:u w:color="000000"/>
+          <w:lang w:eastAsia="zh-TW"/>
+        </w:rPr>
+      </w:pPr>
+    </w:p>
+    <w:p>
+      <w:pPr>
+        <w:rPr>
+          <w:rFonts w:ascii="Robo" w:hAnsi="Robo"/>
+          <w:color w:val="000000"/>
+          <w:u w:color="000000"/>
+          <w:lang w:eastAsia="zh-TW"/>
+        </w:rPr>
+      </w:pPr>
+      <w:r>
+        <w:rPr>
+          <w:rFonts w:ascii="Robo" w:hAnsi="Robo"/>
+          <w:color w:val="000000"/>
+          <w:u w:color="000000"/>
+          <w:lang w:eastAsia="zh-TW"/>
+        </w:rPr>
+        <w:t xml:space="preserve">We can see the wall time is improved </w:t>
+      </w:r>
+      <w:r>
+        <w:rPr>
+          <w:rFonts w:ascii="Robo" w:hAnsi="Robo"/>
+          <w:color w:val="000000"/>
+          <w:u w:color="000000"/>
+          <w:lang w:eastAsia="zh-TW"/>
+        </w:rPr>
+        <w:t xml:space="preserve">and having better performance than </w:t>
+      </w:r>
+      <w:proofErr w:type="spellStart"/>
+      <w:r>
+        <w:rPr>
+          <w:rFonts w:ascii="Robo" w:hAnsi="Robo"/>
+          <w:color w:val="000000"/>
+          <w:u w:color="000000"/>
+          <w:lang w:eastAsia="zh-TW"/>
+        </w:rPr>
+        <w:t>omp</w:t>
+      </w:r>
+      <w:proofErr w:type="spellEnd"/>
+      <w:r>
+        <w:rPr>
+          <w:rFonts w:ascii="Robo" w:hAnsi="Robo"/>
+          <w:color w:val="000000"/>
+          <w:u w:color="000000"/>
+          <w:lang w:eastAsia="zh-TW"/>
+        </w:rPr>
+        <w:t>.</w:t>
+      </w:r>
+    </w:p>
+    <w:p>
+      <w:pPr>
+        <w:rPr>
+          <w:rFonts w:ascii="Robo" w:hAnsi="Robo"/>
+          <w:b/>
+          <w:bCs/>
+          <w:color w:val="000000"/>
+          <w:u w:color="000000"/>
+          <w:lang w:eastAsia="zh-TW"/>
+        </w:rPr>
+      </w:pPr>
+    </w:p>
+    <w:p>
+      <w:pPr>
+        <w:rPr>
+          <w:rFonts w:ascii="Robo" w:hAnsi="Robo"/>
+          <w:b/>
+          <w:bCs/>
+          <w:color w:val="000000"/>
+          <w:u w:color="000000"/>
+          <w:lang w:eastAsia="zh-TW"/>
+        </w:rPr>
+      </w:pPr>
+      <w:r>
+        <w:rPr>
+          <w:rFonts w:ascii="Robo" w:hAnsi="Robo"/>
+          <w:b/>
+          <w:bCs/>
+          <w:color w:val="000000"/>
+          <w:u w:color="000000"/>
+          <w:lang w:eastAsia="zh-TW"/>
+        </w:rPr>
+        <w:t xml:space="preserve">Step 9 – Comparing OpenMP and </w:t>
+      </w:r>
+      <w:proofErr w:type="spellStart"/>
+      <w:r>
+        <w:rPr>
+          <w:rFonts w:ascii="Robo" w:hAnsi="Robo"/>
+          <w:b/>
+          <w:bCs/>
+          <w:color w:val="000000"/>
+          <w:u w:color="000000"/>
+          <w:lang w:eastAsia="zh-TW"/>
+        </w:rPr>
+        <w:t>pthreads</w:t>
+      </w:r>
+      <w:proofErr w:type="spellEnd"/>
+    </w:p>
+    <w:p>
+      <w:pPr>
+        <w:rPr>
+          <w:rFonts w:ascii="Robo" w:hAnsi="Robo"/>
+          <w:b/>
+          <w:bCs/>
+          <w:color w:val="000000"/>
+          <w:u w:color="000000"/>
+          <w:lang w:eastAsia="zh-TW"/>
+        </w:rPr>
+      </w:pPr>
+    </w:p>
+    <w:tbl>
+      <w:tblPr>
+        <w:tblStyle w:val="af2"/>
+        <w:tblW w:w="0" w:type="auto"/>
+        <w:tblLook w:val="04A0" w:firstRow="1" w:lastRow="0" w:firstColumn="1" w:lastColumn="0" w:noHBand="0" w:noVBand="1"/>
+      </w:tblPr>
+      <w:tblGrid>
+        <w:gridCol w:w="758"/>
+        <w:gridCol w:w="1404"/>
+        <w:gridCol w:w="1400"/>
+        <w:gridCol w:w="2103"/>
+        <w:gridCol w:w="1382"/>
+        <w:gridCol w:w="2303"/>
+      </w:tblGrid>
+      <w:tr>
+        <w:tc>
+          <w:tcPr>
+            <w:tcW w:w="758" w:type="dxa"/>
+          </w:tcPr>
+          <w:p>
+            <w:pPr>
+              <w:pBdr>
+                <w:top w:val="none" w:sz="0" w:space="0" w:color="auto"/>
+                <w:left w:val="none" w:sz="0" w:space="0" w:color="auto"/>
+                <w:bottom w:val="none" w:sz="0" w:space="0" w:color="auto"/>
+                <w:right w:val="none" w:sz="0" w:space="0" w:color="auto"/>
+                <w:between w:val="none" w:sz="0" w:space="0" w:color="auto"/>
+                <w:bar w:val="none" w:sz="0" w:color="auto"/>
+              </w:pBdr>
+              <w:rPr>
+                <w:rFonts w:ascii="Robo" w:hAnsi="Robo"/>
+                <w:color w:val="000000"/>
+                <w:u w:color="000000"/>
+                <w:lang w:eastAsia="zh-TW"/>
+              </w:rPr>
+            </w:pPr>
+          </w:p>
+        </w:tc>
+        <w:tc>
+          <w:tcPr>
+            <w:tcW w:w="1404" w:type="dxa"/>
+            <w:shd w:val="clear" w:color="auto" w:fill="7F7F7F" w:themeFill="text1" w:themeFillTint="80"/>
+          </w:tcPr>
+          <w:p>
+            <w:pPr>
+              <w:pBdr>
+                <w:top w:val="none" w:sz="0" w:space="0" w:color="auto"/>
+                <w:left w:val="none" w:sz="0" w:space="0" w:color="auto"/>
+                <w:bottom w:val="none" w:sz="0" w:space="0" w:color="auto"/>
+                <w:right w:val="none" w:sz="0" w:space="0" w:color="auto"/>
+                <w:between w:val="none" w:sz="0" w:space="0" w:color="auto"/>
+                <w:bar w:val="none" w:sz="0" w:color="auto"/>
+              </w:pBdr>
+              <w:rPr>
+                <w:rFonts w:ascii="Robo" w:hAnsi="Robo"/>
+                <w:color w:val="000000"/>
+                <w:u w:color="000000"/>
+                <w:lang w:eastAsia="zh-TW"/>
+              </w:rPr>
+            </w:pPr>
+            <w:r>
+              <w:rPr>
+                <w:rFonts w:ascii="Robo" w:hAnsi="Robo"/>
+                <w:color w:val="000000"/>
+                <w:u w:color="000000"/>
+                <w:lang w:eastAsia="zh-TW"/>
+              </w:rPr>
+              <w:t>Original</w:t>
+            </w:r>
+          </w:p>
+        </w:tc>
+        <w:tc>
+          <w:tcPr>
+            <w:tcW w:w="1400" w:type="dxa"/>
+            <w:shd w:val="clear" w:color="auto" w:fill="FBE4D5" w:themeFill="accent2" w:themeFillTint="33"/>
+          </w:tcPr>
+          <w:p>
+            <w:pPr>
+              <w:pBdr>
+                <w:top w:val="none" w:sz="0" w:space="0" w:color="auto"/>
+                <w:left w:val="none" w:sz="0" w:space="0" w:color="auto"/>
+                <w:bottom w:val="none" w:sz="0" w:space="0" w:color="auto"/>
+                <w:right w:val="none" w:sz="0" w:space="0" w:color="auto"/>
+                <w:between w:val="none" w:sz="0" w:space="0" w:color="auto"/>
+                <w:bar w:val="none" w:sz="0" w:color="auto"/>
+              </w:pBdr>
+              <w:rPr>
+                <w:rFonts w:ascii="Robo" w:hAnsi="Robo"/>
+                <w:color w:val="000000"/>
+                <w:u w:color="000000"/>
+                <w:lang w:eastAsia="zh-TW"/>
+              </w:rPr>
+            </w:pPr>
+            <w:r>
+              <w:rPr>
+                <w:rFonts w:ascii="Robo" w:hAnsi="Robo"/>
+                <w:color w:val="000000"/>
+                <w:u w:color="000000"/>
+                <w:lang w:eastAsia="zh-TW"/>
+              </w:rPr>
+              <w:t>OMP</w:t>
+            </w:r>
+          </w:p>
+        </w:tc>
+        <w:tc>
+          <w:tcPr>
+            <w:tcW w:w="2103" w:type="dxa"/>
+            <w:shd w:val="clear" w:color="auto" w:fill="F7CAAC" w:themeFill="accent2" w:themeFillTint="66"/>
+          </w:tcPr>
+          <w:p>
+            <w:pPr>
+              <w:pBdr>
+                <w:top w:val="none" w:sz="0" w:space="0" w:color="auto"/>
+                <w:left w:val="none" w:sz="0" w:space="0" w:color="auto"/>
+                <w:bottom w:val="none" w:sz="0" w:space="0" w:color="auto"/>
+                <w:right w:val="none" w:sz="0" w:space="0" w:color="auto"/>
+                <w:between w:val="none" w:sz="0" w:space="0" w:color="auto"/>
+                <w:bar w:val="none" w:sz="0" w:color="auto"/>
+              </w:pBdr>
+              <w:rPr>
+                <w:rFonts w:ascii="Robo" w:hAnsi="Robo"/>
+                <w:color w:val="000000"/>
+                <w:u w:color="000000"/>
+                <w:lang w:eastAsia="zh-TW"/>
+              </w:rPr>
+            </w:pPr>
+            <w:r>
+              <w:rPr>
+                <w:rFonts w:ascii="Robo" w:hAnsi="Robo"/>
+                <w:color w:val="000000"/>
+                <w:u w:color="000000"/>
+                <w:lang w:eastAsia="zh-TW"/>
+              </w:rPr>
+              <w:t>OMP to Original</w:t>
+            </w:r>
+          </w:p>
+        </w:tc>
+        <w:tc>
+          <w:tcPr>
+            <w:tcW w:w="1382" w:type="dxa"/>
+            <w:shd w:val="clear" w:color="auto" w:fill="E2EFD9" w:themeFill="accent6" w:themeFillTint="33"/>
+          </w:tcPr>
+          <w:p>
+            <w:pPr>
+              <w:pBdr>
+                <w:top w:val="none" w:sz="0" w:space="0" w:color="auto"/>
+                <w:left w:val="none" w:sz="0" w:space="0" w:color="auto"/>
+                <w:bottom w:val="none" w:sz="0" w:space="0" w:color="auto"/>
+                <w:right w:val="none" w:sz="0" w:space="0" w:color="auto"/>
+                <w:between w:val="none" w:sz="0" w:space="0" w:color="auto"/>
+                <w:bar w:val="none" w:sz="0" w:color="auto"/>
+              </w:pBdr>
+              <w:rPr>
+                <w:rFonts w:ascii="Robo" w:hAnsi="Robo"/>
+                <w:color w:val="000000"/>
+                <w:u w:color="000000"/>
+                <w:lang w:eastAsia="zh-TW"/>
+              </w:rPr>
+            </w:pPr>
+            <w:proofErr w:type="spellStart"/>
+            <w:r>
+              <w:rPr>
+                <w:rFonts w:ascii="Robo" w:hAnsi="Robo"/>
+                <w:color w:val="000000"/>
+                <w:u w:color="000000"/>
+                <w:lang w:eastAsia="zh-TW"/>
+              </w:rPr>
+              <w:t>pThread</w:t>
+            </w:r>
+            <w:proofErr w:type="spellEnd"/>
+          </w:p>
+        </w:tc>
+        <w:tc>
+          <w:tcPr>
+            <w:tcW w:w="2303" w:type="dxa"/>
+            <w:shd w:val="clear" w:color="auto" w:fill="C5E0B3" w:themeFill="accent6" w:themeFillTint="66"/>
+          </w:tcPr>
+          <w:p>
+            <w:pPr>
+              <w:pBdr>
+                <w:top w:val="none" w:sz="0" w:space="0" w:color="auto"/>
+                <w:left w:val="none" w:sz="0" w:space="0" w:color="auto"/>
+                <w:bottom w:val="none" w:sz="0" w:space="0" w:color="auto"/>
+                <w:right w:val="none" w:sz="0" w:space="0" w:color="auto"/>
+                <w:between w:val="none" w:sz="0" w:space="0" w:color="auto"/>
+                <w:bar w:val="none" w:sz="0" w:color="auto"/>
+              </w:pBdr>
+              <w:rPr>
+                <w:rFonts w:ascii="Robo" w:hAnsi="Robo"/>
+                <w:color w:val="000000"/>
+                <w:u w:color="000000"/>
+                <w:lang w:eastAsia="zh-TW"/>
+              </w:rPr>
+            </w:pPr>
+            <w:proofErr w:type="spellStart"/>
+            <w:r>
+              <w:rPr>
+                <w:rFonts w:ascii="Robo" w:hAnsi="Robo"/>
+                <w:color w:val="000000"/>
+                <w:u w:color="000000"/>
+                <w:lang w:eastAsia="zh-TW"/>
+              </w:rPr>
+              <w:t>pThread</w:t>
+            </w:r>
+            <w:proofErr w:type="spellEnd"/>
+            <w:r>
+              <w:rPr>
+                <w:rFonts w:ascii="Robo" w:hAnsi="Robo"/>
+                <w:color w:val="000000"/>
+                <w:u w:color="000000"/>
+                <w:lang w:eastAsia="zh-TW"/>
+              </w:rPr>
+              <w:t xml:space="preserve"> to Original</w:t>
+            </w:r>
+          </w:p>
+        </w:tc>
+      </w:tr>
+      <w:tr>
+        <w:tc>
+          <w:tcPr>
+            <w:tcW w:w="758" w:type="dxa"/>
+          </w:tcPr>
+          <w:p>
+            <w:pPr>
+              <w:pBdr>
+                <w:top w:val="none" w:sz="0" w:space="0" w:color="auto"/>
+                <w:left w:val="none" w:sz="0" w:space="0" w:color="auto"/>
+                <w:bottom w:val="none" w:sz="0" w:space="0" w:color="auto"/>
+                <w:right w:val="none" w:sz="0" w:space="0" w:color="auto"/>
+                <w:between w:val="none" w:sz="0" w:space="0" w:color="auto"/>
+                <w:bar w:val="none" w:sz="0" w:color="auto"/>
+              </w:pBdr>
+              <w:rPr>
+                <w:rFonts w:ascii="Robo" w:hAnsi="Robo"/>
+                <w:color w:val="000000"/>
+                <w:u w:color="000000"/>
+                <w:lang w:eastAsia="zh-TW"/>
+              </w:rPr>
+            </w:pPr>
+            <w:r>
+              <w:rPr>
+                <w:rFonts w:ascii="Robo" w:eastAsia="Calibri" w:hAnsi="Robo"/>
+                <w:color w:val="000000"/>
+                <w:u w:color="000000"/>
+                <w:lang w:eastAsia="zh-CN"/>
+              </w:rPr>
+              <w:t>real</w:t>
+            </w:r>
+          </w:p>
+        </w:tc>
+        <w:tc>
+          <w:tcPr>
+            <w:tcW w:w="1404" w:type="dxa"/>
+          </w:tcPr>
+          <w:p>
+            <w:pPr>
+              <w:pBdr>
+                <w:top w:val="none" w:sz="0" w:space="0" w:color="auto"/>
+                <w:left w:val="none" w:sz="0" w:space="0" w:color="auto"/>
+                <w:bottom w:val="none" w:sz="0" w:space="0" w:color="auto"/>
+                <w:right w:val="none" w:sz="0" w:space="0" w:color="auto"/>
+                <w:between w:val="none" w:sz="0" w:space="0" w:color="auto"/>
+                <w:bar w:val="none" w:sz="0" w:color="auto"/>
+              </w:pBdr>
+              <w:jc w:val="center"/>
+              <w:rPr>
+                <w:rFonts w:ascii="Robo" w:hAnsi="Robo"/>
+                <w:color w:val="000000"/>
+                <w:sz w:val="20"/>
+                <w:szCs w:val="20"/>
+                <w:u w:color="000000"/>
+                <w:lang w:eastAsia="zh-TW"/>
+              </w:rPr>
+            </w:pPr>
+            <w:r>
+              <w:rPr>
+                <w:rFonts w:ascii="Robo" w:eastAsia="Calibri" w:hAnsi="Robo"/>
+                <w:color w:val="000000"/>
+                <w:sz w:val="20"/>
+                <w:szCs w:val="20"/>
+                <w:u w:color="000000"/>
+                <w:lang w:eastAsia="zh-CN"/>
+              </w:rPr>
+              <w:t>0m0.992s</w:t>
+            </w:r>
+          </w:p>
+        </w:tc>
+        <w:tc>
+          <w:tcPr>
+            <w:tcW w:w="1400" w:type="dxa"/>
+          </w:tcPr>
+          <w:p>
+            <w:pPr>
+              <w:jc w:val="center"/>
+              <w:rPr>
+                <w:rFonts w:ascii="Robo" w:eastAsia="Calibri" w:hAnsi="Robo"/>
+                <w:color w:val="000000"/>
+                <w:sz w:val="20"/>
+                <w:szCs w:val="20"/>
+                <w:u w:color="000000"/>
+                <w:lang w:eastAsia="zh-CN"/>
+              </w:rPr>
+            </w:pPr>
+            <w:r>
+              <w:rPr>
+                <w:rFonts w:ascii="Robo" w:eastAsia="Calibri" w:hAnsi="Robo"/>
+                <w:color w:val="000000"/>
+                <w:sz w:val="20"/>
+                <w:szCs w:val="20"/>
+                <w:u w:color="000000"/>
+                <w:lang w:eastAsia="zh-CN"/>
+              </w:rPr>
+              <w:t>0m0.662s</w:t>
+            </w:r>
+          </w:p>
+        </w:tc>
+        <w:tc>
+          <w:tcPr>
+            <w:tcW w:w="2103" w:type="dxa"/>
+          </w:tcPr>
+          <w:p>
+            <w:pPr>
+              <w:jc w:val="center"/>
+              <w:rPr>
+                <w:rFonts w:ascii="Robo" w:hAnsi="Robo"/>
+                <w:color w:val="000000"/>
+                <w:sz w:val="20"/>
+                <w:szCs w:val="20"/>
+                <w:u w:color="000000"/>
+                <w:lang w:eastAsia="zh-TW"/>
+              </w:rPr>
+            </w:pPr>
+            <w:r>
+              <w:rPr>
+                <w:rFonts w:ascii="Robo" w:hAnsi="Robo"/>
+                <w:color w:val="000000"/>
+                <w:sz w:val="20"/>
+                <w:szCs w:val="20"/>
+                <w:u w:color="000000"/>
+                <w:lang w:eastAsia="zh-TW"/>
+              </w:rPr>
+              <w:t xml:space="preserve">Improve </w:t>
+            </w:r>
+            <w:r>
+              <w:rPr>
+                <w:rFonts w:ascii="Robo" w:hAnsi="Robo"/>
+                <w:color w:val="000000"/>
+                <w:sz w:val="20"/>
+                <w:szCs w:val="20"/>
+                <w:u w:color="000000"/>
+                <w:lang w:eastAsia="zh-TW"/>
+              </w:rPr>
+              <w:t>33.3%</w:t>
+            </w:r>
+          </w:p>
+        </w:tc>
+        <w:tc>
+          <w:tcPr>
+            <w:tcW w:w="1382" w:type="dxa"/>
+          </w:tcPr>
+          <w:p>
+            <w:pPr>
+              <w:jc w:val="center"/>
+              <w:rPr>
+                <w:rFonts w:ascii="Robo" w:hAnsi="Robo"/>
+                <w:color w:val="000000"/>
+                <w:sz w:val="20"/>
+                <w:szCs w:val="20"/>
+                <w:u w:color="000000"/>
+                <w:lang w:eastAsia="zh-TW"/>
+              </w:rPr>
+            </w:pPr>
+            <w:r>
+              <w:rPr>
+                <w:rFonts w:ascii="Robo" w:hAnsi="Robo"/>
+                <w:color w:val="000000"/>
+                <w:sz w:val="20"/>
+                <w:szCs w:val="20"/>
+                <w:u w:color="000000"/>
+                <w:lang w:eastAsia="zh-TW"/>
+              </w:rPr>
+              <w:t>0m0.530s</w:t>
+            </w:r>
+          </w:p>
+        </w:tc>
+        <w:tc>
+          <w:tcPr>
+            <w:tcW w:w="2303" w:type="dxa"/>
+          </w:tcPr>
+          <w:p>
+            <w:pPr>
+              <w:jc w:val="center"/>
+              <w:rPr>
+                <w:rFonts w:ascii="Robo" w:hAnsi="Robo"/>
+                <w:color w:val="000000"/>
+                <w:sz w:val="20"/>
+                <w:szCs w:val="20"/>
+                <w:u w:color="000000"/>
+                <w:lang w:eastAsia="zh-TW"/>
+              </w:rPr>
+            </w:pPr>
+            <w:r>
+              <w:rPr>
+                <w:rFonts w:ascii="Robo" w:hAnsi="Robo"/>
+                <w:color w:val="000000"/>
+                <w:sz w:val="20"/>
+                <w:szCs w:val="20"/>
+                <w:u w:color="000000"/>
+                <w:lang w:eastAsia="zh-TW"/>
+              </w:rPr>
+              <w:t>Improve 46.6%</w:t>
+            </w:r>
+          </w:p>
+        </w:tc>
+      </w:tr>
+      <w:tr>
+        <w:tc>
+          <w:tcPr>
+            <w:tcW w:w="758" w:type="dxa"/>
+          </w:tcPr>
+          <w:p>
+            <w:pPr>
+              <w:pBdr>
+                <w:top w:val="none" w:sz="0" w:space="0" w:color="auto"/>
+                <w:left w:val="none" w:sz="0" w:space="0" w:color="auto"/>
+                <w:bottom w:val="none" w:sz="0" w:space="0" w:color="auto"/>
+                <w:right w:val="none" w:sz="0" w:space="0" w:color="auto"/>
+                <w:between w:val="none" w:sz="0" w:space="0" w:color="auto"/>
+                <w:bar w:val="none" w:sz="0" w:color="auto"/>
+              </w:pBdr>
+              <w:rPr>
+                <w:rFonts w:ascii="Robo" w:hAnsi="Robo"/>
+                <w:color w:val="000000"/>
+                <w:u w:color="000000"/>
+                <w:lang w:eastAsia="zh-TW"/>
+              </w:rPr>
+            </w:pPr>
+            <w:r>
+              <w:rPr>
+                <w:rFonts w:ascii="Robo" w:eastAsia="Calibri" w:hAnsi="Robo"/>
+                <w:color w:val="000000"/>
+                <w:u w:color="000000"/>
+                <w:lang w:eastAsia="zh-CN"/>
+              </w:rPr>
+              <w:t>user</w:t>
+            </w:r>
+          </w:p>
+        </w:tc>
+        <w:tc>
+          <w:tcPr>
+            <w:tcW w:w="1404" w:type="dxa"/>
+          </w:tcPr>
+          <w:p>
+            <w:pPr>
+              <w:jc w:val="center"/>
+              <w:rPr>
+                <w:rFonts w:ascii="Robo" w:eastAsia="Calibri" w:hAnsi="Robo"/>
+                <w:color w:val="000000"/>
+                <w:sz w:val="20"/>
+                <w:szCs w:val="20"/>
+                <w:u w:color="000000"/>
+                <w:lang w:eastAsia="zh-CN"/>
+              </w:rPr>
+            </w:pPr>
+            <w:r>
+              <w:rPr>
+                <w:rFonts w:ascii="Robo" w:eastAsia="Calibri" w:hAnsi="Robo"/>
+                <w:color w:val="000000"/>
+                <w:sz w:val="20"/>
+                <w:szCs w:val="20"/>
+                <w:u w:color="000000"/>
+                <w:lang w:eastAsia="zh-CN"/>
+              </w:rPr>
+              <w:t>0m0.902s</w:t>
+            </w:r>
+          </w:p>
+        </w:tc>
+        <w:tc>
+          <w:tcPr>
+            <w:tcW w:w="1400" w:type="dxa"/>
+          </w:tcPr>
+          <w:p>
+            <w:pPr>
+              <w:jc w:val="center"/>
+              <w:rPr>
+                <w:rFonts w:ascii="Robo" w:eastAsia="Calibri" w:hAnsi="Robo"/>
+                <w:color w:val="000000"/>
+                <w:sz w:val="20"/>
+                <w:szCs w:val="20"/>
+                <w:u w:color="000000"/>
+                <w:lang w:eastAsia="zh-CN"/>
+              </w:rPr>
+            </w:pPr>
+            <w:r>
+              <w:rPr>
+                <w:rFonts w:ascii="Robo" w:eastAsia="Calibri" w:hAnsi="Robo"/>
+                <w:color w:val="000000"/>
+                <w:sz w:val="20"/>
+                <w:szCs w:val="20"/>
+                <w:u w:color="000000"/>
+                <w:lang w:eastAsia="zh-CN"/>
+              </w:rPr>
+              <w:t>0m0.913s</w:t>
+            </w:r>
+          </w:p>
+        </w:tc>
+        <w:tc>
+          <w:tcPr>
+            <w:tcW w:w="2103" w:type="dxa"/>
+          </w:tcPr>
+          <w:p>
+            <w:pPr>
+              <w:jc w:val="center"/>
+              <w:rPr>
+                <w:rFonts w:ascii="Robo" w:hAnsi="Robo"/>
+                <w:color w:val="000000"/>
+                <w:sz w:val="20"/>
+                <w:szCs w:val="20"/>
+                <w:u w:color="000000"/>
+                <w:lang w:eastAsia="zh-TW"/>
+              </w:rPr>
+            </w:pPr>
+            <w:r>
+              <w:rPr>
+                <w:rFonts w:ascii="Robo" w:hAnsi="Robo"/>
+                <w:color w:val="000000"/>
+                <w:sz w:val="20"/>
+                <w:szCs w:val="20"/>
+                <w:u w:color="000000"/>
+                <w:lang w:eastAsia="zh-TW"/>
+              </w:rPr>
+              <w:t xml:space="preserve">Deteriorate </w:t>
+            </w:r>
+            <w:r>
+              <w:rPr>
+                <w:rFonts w:ascii="Robo" w:hAnsi="Robo"/>
+                <w:color w:val="000000"/>
+                <w:sz w:val="20"/>
+                <w:szCs w:val="20"/>
+                <w:u w:color="000000"/>
+                <w:lang w:eastAsia="zh-TW"/>
+              </w:rPr>
+              <w:t>1.2%</w:t>
+            </w:r>
+          </w:p>
+        </w:tc>
+        <w:tc>
+          <w:tcPr>
+            <w:tcW w:w="1382" w:type="dxa"/>
+          </w:tcPr>
+          <w:p>
+            <w:pPr>
+              <w:jc w:val="center"/>
+              <w:rPr>
+                <w:rFonts w:ascii="Robo" w:hAnsi="Robo"/>
+                <w:color w:val="000000"/>
+                <w:sz w:val="20"/>
+                <w:szCs w:val="20"/>
+                <w:u w:color="000000"/>
+                <w:lang w:eastAsia="zh-TW"/>
+              </w:rPr>
+            </w:pPr>
+            <w:r>
+              <w:rPr>
+                <w:rFonts w:ascii="Robo" w:hAnsi="Robo"/>
+                <w:color w:val="000000"/>
+                <w:sz w:val="20"/>
+                <w:szCs w:val="20"/>
+                <w:u w:color="000000"/>
+                <w:lang w:eastAsia="zh-TW"/>
+              </w:rPr>
+              <w:t>0m0.779s</w:t>
+            </w:r>
+          </w:p>
+        </w:tc>
+        <w:tc>
+          <w:tcPr>
+            <w:tcW w:w="2303" w:type="dxa"/>
+          </w:tcPr>
+          <w:p>
+            <w:pPr>
+              <w:jc w:val="center"/>
+              <w:rPr>
+                <w:rFonts w:ascii="Robo" w:hAnsi="Robo"/>
+                <w:color w:val="000000"/>
+                <w:sz w:val="20"/>
+                <w:szCs w:val="20"/>
+                <w:u w:color="000000"/>
+                <w:lang w:eastAsia="zh-TW"/>
+              </w:rPr>
+            </w:pPr>
+            <w:r>
+              <w:rPr>
+                <w:rFonts w:ascii="Robo" w:hAnsi="Robo"/>
+                <w:color w:val="000000"/>
+                <w:sz w:val="20"/>
+                <w:szCs w:val="20"/>
+                <w:u w:color="000000"/>
+                <w:lang w:eastAsia="zh-TW"/>
+              </w:rPr>
+              <w:t>Improve 13.6%</w:t>
+            </w:r>
+          </w:p>
+        </w:tc>
+      </w:tr>
+      <w:tr>
+        <w:tc>
+          <w:tcPr>
+            <w:tcW w:w="758" w:type="dxa"/>
+          </w:tcPr>
+          <w:p>
+            <w:pPr>
+              <w:pBdr>
+                <w:top w:val="none" w:sz="0" w:space="0" w:color="auto"/>
+                <w:left w:val="none" w:sz="0" w:space="0" w:color="auto"/>
+                <w:bottom w:val="none" w:sz="0" w:space="0" w:color="auto"/>
+                <w:right w:val="none" w:sz="0" w:space="0" w:color="auto"/>
+                <w:between w:val="none" w:sz="0" w:space="0" w:color="auto"/>
+                <w:bar w:val="none" w:sz="0" w:color="auto"/>
+              </w:pBdr>
+              <w:rPr>
+                <w:rFonts w:ascii="Robo" w:hAnsi="Robo"/>
+                <w:color w:val="000000"/>
+                <w:u w:color="000000"/>
+                <w:lang w:eastAsia="zh-TW"/>
+              </w:rPr>
+            </w:pPr>
+            <w:r>
+              <w:rPr>
+                <w:rFonts w:ascii="Robo" w:eastAsia="Calibri" w:hAnsi="Robo"/>
+                <w:color w:val="000000"/>
+                <w:u w:color="000000"/>
+                <w:lang w:eastAsia="zh-CN"/>
+              </w:rPr>
+              <w:t>sys</w:t>
+            </w:r>
+          </w:p>
+        </w:tc>
+        <w:tc>
+          <w:tcPr>
+            <w:tcW w:w="1404" w:type="dxa"/>
+          </w:tcPr>
+          <w:p>
+            <w:pPr>
+              <w:jc w:val="center"/>
+              <w:rPr>
+                <w:rFonts w:ascii="Robo" w:eastAsia="Calibri" w:hAnsi="Robo"/>
+                <w:color w:val="000000"/>
+                <w:sz w:val="20"/>
+                <w:szCs w:val="20"/>
+                <w:u w:color="000000"/>
+                <w:lang w:eastAsia="zh-CN"/>
+              </w:rPr>
+            </w:pPr>
+            <w:r>
+              <w:rPr>
+                <w:rFonts w:ascii="Robo" w:eastAsia="Calibri" w:hAnsi="Robo"/>
+                <w:color w:val="000000"/>
+                <w:sz w:val="20"/>
+                <w:szCs w:val="20"/>
+                <w:u w:color="000000"/>
+                <w:lang w:eastAsia="zh-CN"/>
+              </w:rPr>
+              <w:t>0m0.020s</w:t>
+            </w:r>
+          </w:p>
+        </w:tc>
+        <w:tc>
+          <w:tcPr>
+            <w:tcW w:w="1400" w:type="dxa"/>
+          </w:tcPr>
+          <w:p>
+            <w:pPr>
+              <w:jc w:val="center"/>
+              <w:rPr>
+                <w:rFonts w:ascii="Robo" w:eastAsia="Calibri" w:hAnsi="Robo"/>
+                <w:color w:val="000000"/>
+                <w:sz w:val="20"/>
+                <w:szCs w:val="20"/>
+                <w:u w:color="000000"/>
+                <w:lang w:eastAsia="zh-CN"/>
+              </w:rPr>
+            </w:pPr>
+            <w:r>
+              <w:rPr>
+                <w:rFonts w:ascii="Robo" w:eastAsia="Calibri" w:hAnsi="Robo"/>
+                <w:color w:val="000000"/>
+                <w:sz w:val="20"/>
+                <w:szCs w:val="20"/>
+                <w:u w:color="000000"/>
+                <w:lang w:eastAsia="zh-CN"/>
+              </w:rPr>
+              <w:t>0m0.044s</w:t>
+            </w:r>
+          </w:p>
+        </w:tc>
+        <w:tc>
+          <w:tcPr>
+            <w:tcW w:w="2103" w:type="dxa"/>
+          </w:tcPr>
+          <w:p>
+            <w:pPr>
+              <w:jc w:val="center"/>
+              <w:rPr>
+                <w:rFonts w:ascii="Robo" w:hAnsi="Robo"/>
+                <w:color w:val="000000"/>
+                <w:sz w:val="20"/>
+                <w:szCs w:val="20"/>
+                <w:u w:color="000000"/>
+                <w:lang w:eastAsia="zh-TW"/>
+              </w:rPr>
+            </w:pPr>
+            <w:r>
+              <w:rPr>
+                <w:rFonts w:ascii="Robo" w:hAnsi="Robo"/>
+                <w:color w:val="000000"/>
+                <w:sz w:val="20"/>
+                <w:szCs w:val="20"/>
+                <w:u w:color="000000"/>
+                <w:lang w:eastAsia="zh-TW"/>
+              </w:rPr>
+              <w:t xml:space="preserve">Deteriorate </w:t>
+            </w:r>
+            <w:r>
+              <w:rPr>
+                <w:rFonts w:ascii="Robo" w:hAnsi="Robo"/>
+                <w:color w:val="000000"/>
+                <w:sz w:val="20"/>
+                <w:szCs w:val="20"/>
+                <w:u w:color="000000"/>
+                <w:lang w:eastAsia="zh-TW"/>
+              </w:rPr>
+              <w:t>120%</w:t>
+            </w:r>
+          </w:p>
+        </w:tc>
+        <w:tc>
+          <w:tcPr>
+            <w:tcW w:w="1382" w:type="dxa"/>
+          </w:tcPr>
+          <w:p>
+            <w:pPr>
+              <w:jc w:val="center"/>
+              <w:rPr>
+                <w:rFonts w:ascii="Robo" w:hAnsi="Robo"/>
+                <w:color w:val="000000"/>
+                <w:sz w:val="20"/>
+                <w:szCs w:val="20"/>
+                <w:u w:color="000000"/>
+                <w:lang w:eastAsia="zh-TW"/>
+              </w:rPr>
+            </w:pPr>
+            <w:r>
+              <w:rPr>
+                <w:rFonts w:ascii="Robo" w:hAnsi="Robo"/>
+                <w:color w:val="000000"/>
+                <w:sz w:val="20"/>
+                <w:szCs w:val="20"/>
+                <w:u w:color="000000"/>
+                <w:lang w:eastAsia="zh-TW"/>
+              </w:rPr>
+              <w:t>0m0.032s</w:t>
+            </w:r>
+          </w:p>
+        </w:tc>
+        <w:tc>
+          <w:tcPr>
+            <w:tcW w:w="2303" w:type="dxa"/>
+          </w:tcPr>
+          <w:p>
+            <w:pPr>
+              <w:jc w:val="center"/>
+              <w:rPr>
+                <w:rFonts w:ascii="Robo" w:hAnsi="Robo"/>
+                <w:color w:val="000000"/>
+                <w:sz w:val="20"/>
+                <w:szCs w:val="20"/>
+                <w:u w:color="000000"/>
+                <w:lang w:eastAsia="zh-TW"/>
+              </w:rPr>
+            </w:pPr>
+            <w:r>
+              <w:rPr>
+                <w:rFonts w:ascii="Robo" w:hAnsi="Robo"/>
+                <w:color w:val="000000"/>
+                <w:sz w:val="20"/>
+                <w:szCs w:val="20"/>
+                <w:u w:color="000000"/>
+                <w:lang w:eastAsia="zh-TW"/>
+              </w:rPr>
+              <w:t>Deteriorate 60%</w:t>
+            </w:r>
+          </w:p>
+        </w:tc>
+      </w:tr>
+    </w:tbl>
+    <w:p>
+      <w:pPr>
+        <w:rPr>
+          <w:rFonts w:ascii="Robo" w:hAnsi="Robo"/>
+          <w:color w:val="000000"/>
+          <w:u w:color="000000"/>
+          <w:lang w:eastAsia="zh-TW"/>
+        </w:rPr>
+      </w:pPr>
+    </w:p>
+    <w:p>
+      <w:pPr>
+        <w:rPr>
+          <w:rFonts w:ascii="Robo" w:hAnsi="Robo"/>
+          <w:color w:val="000000"/>
+          <w:u w:color="000000"/>
+          <w:lang w:eastAsia="zh-TW"/>
+        </w:rPr>
+      </w:pPr>
+      <w:r>
+        <w:rPr>
+          <w:rFonts w:ascii="Robo" w:hAnsi="Robo"/>
+          <w:color w:val="000000"/>
+          <w:u w:color="000000"/>
+          <w:lang w:eastAsia="zh-TW"/>
+        </w:rPr>
+        <w:t xml:space="preserve">From the comparison, we can see that OpenMP is bringing large overhead to the </w:t>
+      </w:r>
+      <w:r>
+        <w:rPr>
+          <w:rFonts w:ascii="Robo" w:hAnsi="Robo"/>
+          <w:color w:val="000000"/>
+          <w:u w:color="000000"/>
+          <w:lang w:eastAsia="zh-TW"/>
+        </w:rPr>
+        <w:t>kernel loading.</w:t>
+      </w:r>
+      <w:r>
+        <w:rPr>
+          <w:rFonts w:ascii="Robo" w:hAnsi="Robo"/>
+          <w:color w:val="000000"/>
+          <w:u w:color="000000"/>
+          <w:lang w:eastAsia="zh-TW"/>
+        </w:rPr>
+        <w:t xml:space="preserve"> And </w:t>
+      </w:r>
+      <w:proofErr w:type="spellStart"/>
+      <w:r>
+        <w:rPr>
+          <w:rFonts w:ascii="Robo" w:hAnsi="Robo"/>
+          <w:color w:val="000000"/>
+          <w:u w:color="000000"/>
+          <w:lang w:eastAsia="zh-TW"/>
+        </w:rPr>
+        <w:t>pthread</w:t>
+      </w:r>
+      <w:proofErr w:type="spellEnd"/>
+      <w:r>
+        <w:rPr>
+          <w:rFonts w:ascii="Robo" w:hAnsi="Robo"/>
+          <w:color w:val="000000"/>
+          <w:u w:color="000000"/>
+          <w:lang w:eastAsia="zh-TW"/>
+        </w:rPr>
+        <w:t xml:space="preserve"> is also resulting in better WALL time improvement.</w:t>
+      </w:r>
+    </w:p>
+    <w:p>
+      <w:pPr>
+        <w:rPr>
+          <w:rFonts w:ascii="Robo" w:hAnsi="Robo" w:hint="eastAsia"/>
+          <w:color w:val="000000"/>
+          <w:u w:color="000000"/>
+          <w:lang w:eastAsia="zh-TW"/>
+        </w:rPr>
+      </w:pPr>
+      <w:r>
+        <w:rPr>
+          <w:rFonts w:ascii="Robo" w:hAnsi="Robo" w:hint="eastAsia"/>
+          <w:color w:val="000000"/>
+          <w:u w:color="000000"/>
+          <w:lang w:eastAsia="zh-TW"/>
+        </w:rPr>
+        <w:br w:type="page"/>
+      </w:r>
+    </w:p>
+    <w:p>
+      <w:pPr>
+        <w:rPr>
+          <w:rFonts w:ascii="Robo" w:hAnsi="Robo"/>
+          <w:b/>
+          <w:bCs/>
+          <w:color w:val="000000"/>
+          <w:u w:color="000000"/>
+          <w:lang w:eastAsia="zh-TW"/>
+        </w:rPr>
+      </w:pPr>
+      <w:r>
+        <w:rPr>
+          <w:rFonts w:ascii="Robo" w:hAnsi="Robo"/>
+          <w:b/>
+          <w:bCs/>
+          <w:color w:val="000000"/>
+          <w:u w:color="000000"/>
+          <w:lang w:eastAsia="zh-TW"/>
+        </w:rPr>
+        <w:lastRenderedPageBreak/>
+        <w:t xml:space="preserve">Step 10 - Applying multi-threading (in OpenMP and </w:t>
+      </w:r>
+      <w:proofErr w:type="spellStart"/>
+      <w:r>
+        <w:rPr>
+          <w:rFonts w:ascii="Robo" w:hAnsi="Robo"/>
+          <w:b/>
+          <w:bCs/>
+          <w:color w:val="000000"/>
+          <w:u w:color="000000"/>
+          <w:lang w:eastAsia="zh-TW"/>
+        </w:rPr>
+        <w:t>pthread</w:t>
+      </w:r>
+      <w:proofErr w:type="spellEnd"/>
+      <w:r>
+        <w:rPr>
+          <w:rFonts w:ascii="Robo" w:hAnsi="Robo"/>
+          <w:b/>
+          <w:bCs/>
+          <w:color w:val="000000"/>
+          <w:u w:color="000000"/>
+          <w:lang w:eastAsia="zh-TW"/>
+        </w:rPr>
+        <w:t xml:space="preserve"> individually) to the camera-capturing-and-edge-detection system (in </w:t>
+      </w:r>
+      <w:proofErr w:type="spellStart"/>
+      <w:r>
+        <w:rPr>
+          <w:rFonts w:ascii="Robo" w:hAnsi="Robo"/>
+          <w:b/>
+          <w:bCs/>
+          <w:color w:val="000000"/>
+          <w:u w:color="000000"/>
+          <w:lang w:eastAsia="zh-TW"/>
+        </w:rPr>
+        <w:t>Proj</w:t>
+      </w:r>
+      <w:proofErr w:type="spellEnd"/>
+      <w:r>
+        <w:rPr>
+          <w:rFonts w:ascii="Robo" w:hAnsi="Robo"/>
+          <w:b/>
+          <w:bCs/>
+          <w:color w:val="000000"/>
+          <w:u w:color="000000"/>
+          <w:lang w:eastAsia="zh-TW"/>
+        </w:rPr>
+        <w:t xml:space="preserve"> #1-b)</w:t>
+      </w:r>
+    </w:p>
+    <w:p>
+      <w:pPr>
+        <w:rPr>
+          <w:rFonts w:ascii="Robo" w:hAnsi="Robo"/>
+          <w:b/>
+          <w:bCs/>
+          <w:color w:val="000000"/>
+          <w:u w:color="000000"/>
+          <w:lang w:eastAsia="zh-TW"/>
+        </w:rPr>
+      </w:pPr>
     </w:p>
     <w:p>
       <w:pPr>

</xml_diff>